<commit_message>
add checkout test scripts
</commit_message>
<xml_diff>
--- a/Summary_Report.docx
+++ b/Summary_Report.docx
@@ -4,7 +4,7 @@
   <w:body>
     <w:p>
       <w:pPr>
-        <w:jc w:val="center"/>
+        <w:jc w:val="both"/>
         <w:rPr>
           <w:rFonts w:cs="Times New Roman"/>
           <w:color w:val="auto"/>
@@ -15,7 +15,7 @@
     </w:p>
     <w:p>
       <w:pPr>
-        <w:jc w:val="center"/>
+        <w:jc w:val="both"/>
         <w:rPr>
           <w:rFonts w:cs="Times New Roman"/>
           <w:color w:val="auto"/>
@@ -26,7 +26,7 @@
     </w:p>
     <w:p>
       <w:pPr>
-        <w:jc w:val="center"/>
+        <w:jc w:val="both"/>
         <w:rPr>
           <w:rFonts w:cs="Times New Roman"/>
           <w:color w:val="auto"/>
@@ -37,7 +37,7 @@
     </w:p>
     <w:p>
       <w:pPr>
-        <w:jc w:val="center"/>
+        <w:jc w:val="both"/>
         <w:rPr>
           <w:rFonts w:cs="Times New Roman"/>
           <w:color w:val="auto"/>
@@ -48,7 +48,7 @@
     </w:p>
     <w:p>
       <w:pPr>
-        <w:jc w:val="center"/>
+        <w:jc w:val="both"/>
         <w:rPr>
           <w:rFonts w:cs="Times New Roman"/>
           <w:color w:val="auto"/>
@@ -84,21 +84,23 @@
           <w:szCs w:val="52"/>
         </w:rPr>
         <w:br/>
-        <w:t>SauceDemo E-Commerce Web Application (Swag Labs)</w:t>
-      </w:r>
-      <w:r>
+        <w:t>SauceDemo E-Commerce Web Application (Swag Labs) – Manual Testing</w:t>
+      </w:r>
+    </w:p>
+    <w:p>
+      <w:pPr>
+        <w:jc w:val="both"/>
         <w:rPr>
           <w:rFonts w:cs="Times New Roman"/>
           <w:color w:val="auto"/>
           <w:sz w:val="52"/>
           <w:szCs w:val="52"/>
         </w:rPr>
-        <w:t xml:space="preserve"> – Manual Testing</w:t>
-      </w:r>
-    </w:p>
-    <w:p>
-      <w:pPr>
-        <w:jc w:val="center"/>
+      </w:pPr>
+    </w:p>
+    <w:p>
+      <w:pPr>
+        <w:jc w:val="both"/>
         <w:rPr>
           <w:rFonts w:cs="Times New Roman"/>
           <w:color w:val="auto"/>
@@ -109,7 +111,7 @@
     </w:p>
     <w:p>
       <w:pPr>
-        <w:jc w:val="center"/>
+        <w:jc w:val="both"/>
         <w:rPr>
           <w:rFonts w:cs="Times New Roman"/>
           <w:color w:val="auto"/>
@@ -120,7 +122,7 @@
     </w:p>
     <w:p>
       <w:pPr>
-        <w:jc w:val="center"/>
+        <w:jc w:val="both"/>
         <w:rPr>
           <w:rFonts w:cs="Times New Roman"/>
           <w:color w:val="auto"/>
@@ -131,7 +133,7 @@
     </w:p>
     <w:p>
       <w:pPr>
-        <w:jc w:val="center"/>
+        <w:jc w:val="both"/>
         <w:rPr>
           <w:rFonts w:cs="Times New Roman"/>
           <w:color w:val="auto"/>
@@ -142,7 +144,7 @@
     </w:p>
     <w:p>
       <w:pPr>
-        <w:jc w:val="center"/>
+        <w:jc w:val="both"/>
         <w:rPr>
           <w:rFonts w:cs="Times New Roman"/>
           <w:color w:val="auto"/>
@@ -153,6 +155,7 @@
     </w:p>
     <w:p>
       <w:pPr>
+        <w:jc w:val="both"/>
         <w:rPr>
           <w:rFonts w:cs="Times New Roman"/>
           <w:color w:val="auto"/>
@@ -163,16 +166,6 @@
     </w:p>
     <w:p>
       <w:pPr>
-        <w:rPr>
-          <w:rFonts w:cs="Times New Roman"/>
-          <w:color w:val="auto"/>
-          <w:sz w:val="52"/>
-          <w:szCs w:val="52"/>
-        </w:rPr>
-      </w:pPr>
-    </w:p>
-    <w:p>
-      <w:pPr>
         <w:pStyle w:val="NoSpacing"/>
         <w:rPr>
           <w:rFonts w:cs="Times New Roman"/>
@@ -292,8 +285,13 @@
     <w:sdt>
       <w:sdtPr>
         <w:rPr>
-          <w:rFonts w:ascii="Times New Roman" w:hAnsi="Times New Roman" w:cs="Times New Roman"/>
-          <w:color w:val="auto"/>
+          <w:rFonts w:ascii="Times New Roman" w:eastAsiaTheme="minorHAnsi" w:hAnsi="Times New Roman" w:cs="Times New Roman"/>
+          <w:color w:val="auto"/>
+          <w:kern w:val="2"/>
+          <w:sz w:val="22"/>
+          <w:szCs w:val="24"/>
+          <w:lang w:eastAsia="en-US"/>
+          <w14:ligatures w14:val="standardContextual"/>
         </w:rPr>
         <w:id w:val="-1224682718"/>
         <w:docPartObj>
@@ -303,20 +301,15 @@
       </w:sdtPr>
       <w:sdtEndPr>
         <w:rPr>
-          <w:rFonts w:eastAsiaTheme="minorHAnsi"/>
           <w:b/>
           <w:bCs/>
-          <w:kern w:val="2"/>
-          <w:sz w:val="22"/>
-          <w:szCs w:val="24"/>
-          <w:lang w:eastAsia="en-US"/>
-          <w14:ligatures w14:val="standardContextual"/>
         </w:rPr>
       </w:sdtEndPr>
       <w:sdtContent>
         <w:p>
           <w:pPr>
             <w:pStyle w:val="TOCHeading"/>
+            <w:jc w:val="both"/>
             <w:rPr>
               <w:rFonts w:ascii="Times New Roman" w:hAnsi="Times New Roman" w:cs="Times New Roman"/>
               <w:color w:val="auto"/>
@@ -337,6 +330,7 @@
               <w:tab w:val="left" w:pos="480"/>
               <w:tab w:val="right" w:pos="9736"/>
             </w:tabs>
+            <w:jc w:val="both"/>
             <w:rPr>
               <w:rFonts w:asciiTheme="minorHAnsi" w:eastAsiaTheme="minorEastAsia" w:hAnsiTheme="minorHAnsi" w:cstheme="minorBidi"/>
               <w:b w:val="0"/>
@@ -454,6 +448,7 @@
               <w:tab w:val="left" w:pos="720"/>
               <w:tab w:val="right" w:pos="9736"/>
             </w:tabs>
+            <w:jc w:val="both"/>
             <w:rPr>
               <w:rFonts w:eastAsiaTheme="minorEastAsia" w:cstheme="minorBidi"/>
               <w:b w:val="0"/>
@@ -552,6 +547,7 @@
               <w:tab w:val="left" w:pos="720"/>
               <w:tab w:val="right" w:pos="9736"/>
             </w:tabs>
+            <w:jc w:val="both"/>
             <w:rPr>
               <w:rFonts w:eastAsiaTheme="minorEastAsia" w:cstheme="minorBidi"/>
               <w:b w:val="0"/>
@@ -650,6 +646,7 @@
               <w:tab w:val="left" w:pos="720"/>
               <w:tab w:val="right" w:pos="9736"/>
             </w:tabs>
+            <w:jc w:val="both"/>
             <w:rPr>
               <w:rFonts w:eastAsiaTheme="minorEastAsia" w:cstheme="minorBidi"/>
               <w:b w:val="0"/>
@@ -743,6 +740,7 @@
         </w:p>
         <w:p>
           <w:pPr>
+            <w:jc w:val="both"/>
             <w:rPr>
               <w:rFonts w:cs="Times New Roman"/>
               <w:color w:val="auto"/>
@@ -762,15 +760,16 @@
     </w:sdt>
     <w:p>
       <w:pPr>
-        <w:rPr>
-          <w:rFonts w:cs="Times New Roman"/>
-          <w:color w:val="auto"/>
-        </w:rPr>
-      </w:pPr>
-    </w:p>
-    <w:p>
-      <w:pPr>
-        <w:jc w:val="center"/>
+        <w:jc w:val="both"/>
+        <w:rPr>
+          <w:rFonts w:cs="Times New Roman"/>
+          <w:color w:val="auto"/>
+        </w:rPr>
+      </w:pPr>
+    </w:p>
+    <w:p>
+      <w:pPr>
+        <w:jc w:val="both"/>
         <w:rPr>
           <w:rFonts w:cs="Times New Roman"/>
           <w:color w:val="auto"/>
@@ -781,7 +780,7 @@
     </w:p>
     <w:p>
       <w:pPr>
-        <w:jc w:val="center"/>
+        <w:jc w:val="both"/>
         <w:rPr>
           <w:rFonts w:cs="Times New Roman"/>
           <w:color w:val="auto"/>
@@ -792,7 +791,7 @@
     </w:p>
     <w:p>
       <w:pPr>
-        <w:jc w:val="center"/>
+        <w:jc w:val="both"/>
         <w:rPr>
           <w:rFonts w:cs="Times New Roman"/>
           <w:color w:val="auto"/>
@@ -803,7 +802,7 @@
     </w:p>
     <w:p>
       <w:pPr>
-        <w:jc w:val="center"/>
+        <w:jc w:val="both"/>
         <w:rPr>
           <w:rFonts w:cs="Times New Roman"/>
           <w:color w:val="auto"/>
@@ -814,7 +813,7 @@
     </w:p>
     <w:p>
       <w:pPr>
-        <w:jc w:val="center"/>
+        <w:jc w:val="both"/>
         <w:rPr>
           <w:rFonts w:cs="Times New Roman"/>
           <w:color w:val="auto"/>
@@ -825,7 +824,7 @@
     </w:p>
     <w:p>
       <w:pPr>
-        <w:jc w:val="center"/>
+        <w:jc w:val="both"/>
         <w:rPr>
           <w:rFonts w:cs="Times New Roman"/>
           <w:color w:val="auto"/>
@@ -845,7 +844,7 @@
     </w:p>
     <w:p>
       <w:pPr>
-        <w:jc w:val="center"/>
+        <w:jc w:val="both"/>
         <w:rPr>
           <w:rFonts w:cs="Times New Roman"/>
           <w:color w:val="auto"/>
@@ -856,7 +855,7 @@
     </w:p>
     <w:p>
       <w:pPr>
-        <w:jc w:val="center"/>
+        <w:jc w:val="both"/>
         <w:rPr>
           <w:rFonts w:cs="Times New Roman"/>
           <w:color w:val="auto"/>
@@ -867,6 +866,7 @@
     </w:p>
     <w:p>
       <w:pPr>
+        <w:jc w:val="both"/>
         <w:rPr>
           <w:rFonts w:cs="Times New Roman"/>
           <w:color w:val="auto"/>
@@ -874,7 +874,7 @@
           <w:szCs w:val="52"/>
         </w:rPr>
         <w:sectPr>
-          <w:footerReference w:type="default" r:id="rId5"/>
+          <w:footerReference w:type="default" r:id="rId7"/>
           <w:pgSz w:w="11906" w:h="16838"/>
           <w:pgMar w:top="1440" w:right="1080" w:bottom="1440" w:left="1080" w:header="708" w:footer="708" w:gutter="0"/>
           <w:pgBorders w:offsetFrom="page">
@@ -890,6 +890,7 @@
     </w:p>
     <w:p>
       <w:pPr>
+        <w:jc w:val="both"/>
         <w:rPr>
           <w:rFonts w:cs="Times New Roman"/>
           <w:color w:val="auto"/>
@@ -901,6 +902,7 @@
     <w:p>
       <w:pPr>
         <w:pStyle w:val="Heading1"/>
+        <w:jc w:val="both"/>
         <w:rPr>
           <w:rFonts w:ascii="Times New Roman" w:hAnsi="Times New Roman" w:cs="Times New Roman"/>
           <w:color w:val="auto"/>
@@ -926,6 +928,7 @@
     <w:p>
       <w:pPr>
         <w:pStyle w:val="Heading2"/>
+        <w:jc w:val="both"/>
         <w:rPr>
           <w:rFonts w:ascii="Times New Roman" w:hAnsi="Times New Roman" w:cs="Times New Roman"/>
           <w:color w:val="auto"/>
@@ -950,17 +953,19 @@
     </w:p>
     <w:p>
       <w:pPr>
-        <w:rPr>
-          <w:rFonts w:cs="Times New Roman"/>
-          <w:color w:val="auto"/>
-        </w:rPr>
-      </w:pPr>
-      <w:r>
-        <w:rPr>
-          <w:rFonts w:cs="Times New Roman"/>
-          <w:color w:val="auto"/>
-        </w:rPr>
-        <w:t xml:space="preserve">• There </w:t>
+        <w:spacing w:line="360" w:lineRule="auto"/>
+        <w:jc w:val="both"/>
+        <w:rPr>
+          <w:rFonts w:cs="Times New Roman"/>
+          <w:color w:val="auto"/>
+        </w:rPr>
+      </w:pPr>
+      <w:r>
+        <w:rPr>
+          <w:rFonts w:cs="Times New Roman"/>
+          <w:color w:val="auto"/>
+        </w:rPr>
+        <w:t xml:space="preserve">There </w:t>
       </w:r>
       <w:r>
         <w:rPr>
@@ -974,337 +979,73 @@
           <w:rFonts w:cs="Times New Roman"/>
           <w:color w:val="auto"/>
         </w:rPr>
-        <w:t xml:space="preserve"> a total of 14 test cases executed for login, browse, cart, and checkout features.</w:t>
-      </w:r>
-    </w:p>
-    <w:p>
-      <w:pPr>
-        <w:rPr>
-          <w:rFonts w:cs="Times New Roman"/>
-          <w:color w:val="auto"/>
-        </w:rPr>
-      </w:pPr>
-      <w:r>
-        <w:rPr>
-          <w:rFonts w:cs="Times New Roman"/>
-          <w:color w:val="auto"/>
-        </w:rPr>
-        <w:t xml:space="preserve">• Multiple functional bugs have been observed while using </w:t>
-      </w:r>
-      <w:proofErr w:type="spellStart"/>
-      <w:r>
-        <w:rPr>
-          <w:rFonts w:cs="Times New Roman"/>
-          <w:color w:val="auto"/>
-        </w:rPr>
-        <w:t>problem_user</w:t>
-      </w:r>
-      <w:proofErr w:type="spellEnd"/>
-      <w:r>
-        <w:rPr>
-          <w:rFonts w:cs="Times New Roman"/>
-          <w:color w:val="auto"/>
-        </w:rPr>
-        <w:t xml:space="preserve"> test data.</w:t>
-      </w:r>
-    </w:p>
-    <w:p>
-      <w:pPr>
-        <w:rPr>
-          <w:rFonts w:cs="Times New Roman"/>
-          <w:color w:val="auto"/>
-        </w:rPr>
-      </w:pPr>
-      <w:r>
-        <w:rPr>
-          <w:rFonts w:cs="Times New Roman"/>
-          <w:color w:val="auto"/>
-        </w:rPr>
-        <w:t>• Price-wise sort functions have not worked properly.</w:t>
-      </w:r>
-    </w:p>
-    <w:p>
-      <w:pPr>
-        <w:rPr>
-          <w:rFonts w:cs="Times New Roman"/>
-          <w:color w:val="auto"/>
-        </w:rPr>
-      </w:pPr>
-      <w:r>
-        <w:rPr>
-          <w:rFonts w:cs="Times New Roman"/>
-          <w:color w:val="auto"/>
-        </w:rPr>
-        <w:t>• 'Add to Cart' and 'Remove from Cart' buttons not responsive under some circumstances.</w:t>
-      </w:r>
-    </w:p>
-    <w:p>
-      <w:pPr>
-        <w:rPr>
-          <w:rFonts w:cs="Times New Roman"/>
-          <w:color w:val="auto"/>
-        </w:rPr>
-      </w:pPr>
-      <w:r>
-        <w:rPr>
-          <w:rFonts w:cs="Times New Roman"/>
-          <w:color w:val="auto"/>
-        </w:rPr>
-        <w:t>• Incorrect functioning of form input boxes.</w:t>
-      </w:r>
-    </w:p>
-    <w:p>
-      <w:pPr>
-        <w:rPr>
-          <w:rFonts w:cs="Times New Roman"/>
-          <w:color w:val="auto"/>
-        </w:rPr>
-      </w:pPr>
-      <w:r>
-        <w:rPr>
-          <w:rFonts w:cs="Times New Roman"/>
-          <w:color w:val="auto"/>
-        </w:rPr>
-        <w:t xml:space="preserve">• </w:t>
-      </w:r>
-      <w:r>
-        <w:rPr>
-          <w:rFonts w:cs="Times New Roman"/>
-          <w:color w:val="auto"/>
-        </w:rPr>
-        <w:t>Most</w:t>
-      </w:r>
-      <w:r>
-        <w:rPr>
-          <w:rFonts w:cs="Times New Roman"/>
-          <w:color w:val="auto"/>
-        </w:rPr>
-        <w:t xml:space="preserve"> </w:t>
-      </w:r>
-      <w:proofErr w:type="spellStart"/>
-      <w:r>
-        <w:rPr>
-          <w:rFonts w:cs="Times New Roman"/>
-          <w:color w:val="auto"/>
-        </w:rPr>
-        <w:t>standard_user</w:t>
-      </w:r>
-      <w:proofErr w:type="spellEnd"/>
-      <w:r>
-        <w:rPr>
-          <w:rFonts w:cs="Times New Roman"/>
-          <w:color w:val="auto"/>
-        </w:rPr>
-        <w:t xml:space="preserve"> test cases have been completed successfully</w:t>
-      </w:r>
-      <w:r>
-        <w:rPr>
-          <w:rFonts w:cs="Times New Roman"/>
-          <w:color w:val="auto"/>
-        </w:rPr>
-        <w:t>.</w:t>
-      </w:r>
-    </w:p>
-    <w:p>
-      <w:pPr>
-        <w:pStyle w:val="Heading2"/>
-        <w:rPr>
-          <w:rFonts w:ascii="Times New Roman" w:hAnsi="Times New Roman" w:cs="Times New Roman"/>
-          <w:color w:val="auto"/>
-        </w:rPr>
-      </w:pPr>
-      <w:bookmarkStart w:id="2" w:name="_Toc228200742"/>
-      <w:r>
-        <w:rPr>
-          <w:rFonts w:ascii="Times New Roman" w:hAnsi="Times New Roman" w:cs="Times New Roman"/>
-          <w:color w:val="auto"/>
-        </w:rPr>
-        <w:t>R</w:t>
-      </w:r>
-      <w:r>
-        <w:rPr>
-          <w:rFonts w:ascii="Times New Roman" w:hAnsi="Times New Roman" w:cs="Times New Roman"/>
-          <w:color w:val="auto"/>
-        </w:rPr>
-        <w:t>elease blockers</w:t>
-      </w:r>
-      <w:bookmarkEnd w:id="2"/>
-    </w:p>
-    <w:p>
-      <w:pPr>
-        <w:rPr>
-          <w:rFonts w:cs="Times New Roman"/>
-          <w:color w:val="auto"/>
-        </w:rPr>
-      </w:pPr>
-      <w:r>
-        <w:rPr>
-          <w:rFonts w:cs="Times New Roman"/>
-          <w:color w:val="auto"/>
-        </w:rPr>
-        <w:t>The following defects were identified as potential release blockers due to their impact on core application functionality:</w:t>
-      </w:r>
-    </w:p>
-    <w:p>
-      <w:pPr>
-        <w:rPr>
-          <w:rFonts w:cs="Times New Roman"/>
-          <w:color w:val="auto"/>
-        </w:rPr>
-      </w:pPr>
-      <w:r>
-        <w:rPr>
-          <w:rFonts w:cs="Times New Roman"/>
-          <w:color w:val="auto"/>
-        </w:rPr>
-        <w:t xml:space="preserve">• Sorting functionality failure when selecting price-based sorting options.  </w:t>
-      </w:r>
-    </w:p>
-    <w:p>
-      <w:pPr>
-        <w:rPr>
-          <w:rFonts w:cs="Times New Roman"/>
-          <w:color w:val="auto"/>
-        </w:rPr>
-      </w:pPr>
-      <w:r>
-        <w:rPr>
-          <w:rFonts w:cs="Times New Roman"/>
-          <w:color w:val="auto"/>
-        </w:rPr>
-        <w:t xml:space="preserve">• Add to Cart button failing to add items to the cart.  </w:t>
-      </w:r>
-    </w:p>
-    <w:p>
-      <w:pPr>
-        <w:rPr>
-          <w:rFonts w:cs="Times New Roman"/>
-          <w:color w:val="auto"/>
-        </w:rPr>
-      </w:pPr>
-      <w:r>
-        <w:rPr>
-          <w:rFonts w:cs="Times New Roman"/>
-          <w:color w:val="auto"/>
-        </w:rPr>
-        <w:t xml:space="preserve">• Remove button failing to remove items from the cart.  </w:t>
-      </w:r>
-    </w:p>
-    <w:p>
-      <w:pPr>
-        <w:rPr>
-          <w:rFonts w:cs="Times New Roman"/>
-          <w:color w:val="auto"/>
-        </w:rPr>
-      </w:pPr>
-      <w:r>
-        <w:rPr>
-          <w:rFonts w:cs="Times New Roman"/>
-          <w:color w:val="auto"/>
-        </w:rPr>
-        <w:t xml:space="preserve">• </w:t>
-      </w:r>
-      <w:r>
-        <w:rPr>
-          <w:rFonts w:cs="Times New Roman"/>
-          <w:color w:val="auto"/>
-        </w:rPr>
-        <w:t xml:space="preserve">Enter </w:t>
-      </w:r>
-      <w:r>
-        <w:rPr>
-          <w:rFonts w:cs="Times New Roman"/>
-          <w:color w:val="auto"/>
-        </w:rPr>
-        <w:t>“</w:t>
-      </w:r>
-      <w:r>
-        <w:rPr>
-          <w:rFonts w:cs="Times New Roman"/>
-          <w:color w:val="auto"/>
-        </w:rPr>
-        <w:t>your details form</w:t>
-      </w:r>
-      <w:r>
-        <w:rPr>
-          <w:rFonts w:cs="Times New Roman"/>
-          <w:color w:val="auto"/>
-        </w:rPr>
-        <w:t>”</w:t>
-      </w:r>
-      <w:r>
-        <w:rPr>
-          <w:rFonts w:cs="Times New Roman"/>
-          <w:color w:val="auto"/>
-        </w:rPr>
-        <w:t xml:space="preserve"> input field synchronization issue</w:t>
-      </w:r>
-      <w:r>
-        <w:rPr>
-          <w:rFonts w:cs="Times New Roman"/>
-          <w:color w:val="auto"/>
-        </w:rPr>
-        <w:t>s</w:t>
-      </w:r>
-      <w:r>
-        <w:rPr>
-          <w:rFonts w:cs="Times New Roman"/>
-          <w:color w:val="auto"/>
-        </w:rPr>
-        <w:t>.</w:t>
-      </w:r>
-    </w:p>
-    <w:p>
-      <w:pPr>
-        <w:rPr>
-          <w:rFonts w:cs="Times New Roman"/>
-          <w:color w:val="auto"/>
-        </w:rPr>
-      </w:pPr>
-      <w:r>
-        <w:rPr>
-          <w:rFonts w:cs="Times New Roman"/>
-          <w:color w:val="auto"/>
-        </w:rPr>
-        <w:t>These defects impact the core shopping workflow and must be resolved before releasing the application to end users.</w:t>
-      </w:r>
-    </w:p>
-    <w:p>
-      <w:pPr>
-        <w:pStyle w:val="Heading2"/>
-        <w:rPr>
-          <w:rFonts w:ascii="Times New Roman" w:hAnsi="Times New Roman" w:cs="Times New Roman"/>
-          <w:color w:val="auto"/>
-        </w:rPr>
-      </w:pPr>
-      <w:bookmarkStart w:id="3" w:name="_Toc228200743"/>
-      <w:r>
-        <w:rPr>
-          <w:rFonts w:ascii="Times New Roman" w:hAnsi="Times New Roman" w:cs="Times New Roman"/>
-          <w:color w:val="auto"/>
-        </w:rPr>
-        <w:t>UX observations</w:t>
-      </w:r>
-      <w:bookmarkEnd w:id="3"/>
+        <w:t xml:space="preserve"> a total of 1</w:t>
+      </w:r>
+      <w:r>
+        <w:rPr>
+          <w:rFonts w:cs="Times New Roman"/>
+          <w:color w:val="auto"/>
+        </w:rPr>
+        <w:t>5</w:t>
+      </w:r>
+      <w:r>
+        <w:rPr>
+          <w:rFonts w:cs="Times New Roman"/>
+          <w:color w:val="auto"/>
+        </w:rPr>
+        <w:t xml:space="preserve"> test cases executed for login, browse, cart, and checkout features.</w:t>
+      </w:r>
     </w:p>
     <w:p>
       <w:pPr>
         <w:pStyle w:val="ListParagraph"/>
         <w:numPr>
           <w:ilvl w:val="0"/>
-          <w:numId w:val="3"/>
+          <w:numId w:val="14"/>
         </w:numPr>
-        <w:rPr>
-          <w:rFonts w:cs="Times New Roman"/>
-          <w:color w:val="auto"/>
-        </w:rPr>
-      </w:pPr>
-      <w:r>
-        <w:rPr>
-          <w:rFonts w:cs="Times New Roman"/>
-          <w:color w:val="auto"/>
-        </w:rPr>
-        <w:t>The Filter dropdown arrow does not work upon clicking and requires clicking directly on the dropdown filter bar.</w:t>
+        <w:spacing w:line="360" w:lineRule="auto"/>
+        <w:jc w:val="both"/>
+        <w:rPr>
+          <w:rFonts w:cs="Times New Roman"/>
+          <w:color w:val="auto"/>
+        </w:rPr>
+      </w:pPr>
+      <w:r>
+        <w:rPr>
+          <w:rFonts w:cs="Times New Roman"/>
+          <w:color w:val="auto"/>
+        </w:rPr>
+        <w:t>Most</w:t>
+      </w:r>
+      <w:r>
+        <w:rPr>
+          <w:rFonts w:cs="Times New Roman"/>
+          <w:color w:val="auto"/>
+        </w:rPr>
+        <w:t xml:space="preserve"> functional bugs have been observed while using </w:t>
+      </w:r>
+      <w:proofErr w:type="spellStart"/>
+      <w:r>
+        <w:rPr>
+          <w:rFonts w:cs="Times New Roman"/>
+          <w:color w:val="auto"/>
+        </w:rPr>
+        <w:t>problem_user</w:t>
+      </w:r>
+      <w:proofErr w:type="spellEnd"/>
+      <w:r>
+        <w:rPr>
+          <w:rFonts w:cs="Times New Roman"/>
+          <w:color w:val="auto"/>
+        </w:rPr>
+        <w:t xml:space="preserve"> </w:t>
+      </w:r>
+      <w:r>
+        <w:rPr>
+          <w:rFonts w:cs="Times New Roman"/>
+          <w:color w:val="auto"/>
+        </w:rPr>
+        <w:t>login credentials.</w:t>
       </w:r>
     </w:p>
     <w:p>
@@ -1312,19 +1053,28 @@
         <w:pStyle w:val="ListParagraph"/>
         <w:numPr>
           <w:ilvl w:val="0"/>
-          <w:numId w:val="3"/>
+          <w:numId w:val="14"/>
         </w:numPr>
-        <w:rPr>
-          <w:rFonts w:cs="Times New Roman"/>
-          <w:color w:val="auto"/>
-        </w:rPr>
-      </w:pPr>
-      <w:r>
-        <w:rPr>
-          <w:rFonts w:cs="Times New Roman"/>
-          <w:color w:val="auto"/>
-        </w:rPr>
-        <w:t xml:space="preserve">There is an alignment issue with the Checkout button on the Cart page when logged in as </w:t>
+        <w:spacing w:line="360" w:lineRule="auto"/>
+        <w:jc w:val="both"/>
+        <w:rPr>
+          <w:rFonts w:cs="Times New Roman"/>
+          <w:color w:val="auto"/>
+        </w:rPr>
+      </w:pPr>
+      <w:r>
+        <w:rPr>
+          <w:rFonts w:cs="Times New Roman"/>
+          <w:color w:val="auto"/>
+        </w:rPr>
+        <w:t xml:space="preserve">Price-wise sort functions have </w:t>
+      </w:r>
+      <w:r>
+        <w:rPr>
+          <w:rFonts w:cs="Times New Roman"/>
+          <w:color w:val="auto"/>
+        </w:rPr>
+        <w:t xml:space="preserve">not worked properly for </w:t>
       </w:r>
       <w:proofErr w:type="spellStart"/>
       <w:r>
@@ -1332,7 +1082,7 @@
           <w:rFonts w:cs="Times New Roman"/>
           <w:color w:val="auto"/>
         </w:rPr>
-        <w:t>visual_user</w:t>
+        <w:t>problem_user</w:t>
       </w:r>
       <w:proofErr w:type="spellEnd"/>
       <w:r>
@@ -1348,19 +1098,51 @@
         <w:pStyle w:val="ListParagraph"/>
         <w:numPr>
           <w:ilvl w:val="0"/>
-          <w:numId w:val="3"/>
+          <w:numId w:val="14"/>
         </w:numPr>
-        <w:rPr>
-          <w:rFonts w:cs="Times New Roman"/>
-          <w:color w:val="auto"/>
-        </w:rPr>
-      </w:pPr>
-      <w:r>
-        <w:rPr>
-          <w:rFonts w:cs="Times New Roman"/>
-          <w:color w:val="auto"/>
-        </w:rPr>
-        <w:t>The sidebar hides the footer contents by overlapping it.</w:t>
+        <w:spacing w:line="360" w:lineRule="auto"/>
+        <w:jc w:val="both"/>
+        <w:rPr>
+          <w:rFonts w:cs="Times New Roman"/>
+          <w:color w:val="auto"/>
+        </w:rPr>
+      </w:pPr>
+      <w:r>
+        <w:rPr>
+          <w:rFonts w:cs="Times New Roman"/>
+          <w:color w:val="auto"/>
+        </w:rPr>
+        <w:t>'Add to Cart' and 'Remove from Cart' buttons not responsive under some circumstances</w:t>
+      </w:r>
+      <w:r>
+        <w:rPr>
+          <w:rFonts w:cs="Times New Roman"/>
+          <w:color w:val="auto"/>
+        </w:rPr>
+        <w:t xml:space="preserve"> </w:t>
+      </w:r>
+      <w:r>
+        <w:rPr>
+          <w:rFonts w:cs="Times New Roman"/>
+          <w:color w:val="auto"/>
+        </w:rPr>
+        <w:t xml:space="preserve">for </w:t>
+      </w:r>
+      <w:proofErr w:type="spellStart"/>
+      <w:r>
+        <w:rPr>
+          <w:rFonts w:cs="Times New Roman"/>
+          <w:color w:val="auto"/>
+        </w:rPr>
+        <w:t>problem_user</w:t>
+      </w:r>
+      <w:proofErr w:type="spellEnd"/>
+      <w:r>
+        <w:rPr>
+          <w:rFonts w:cs="Times New Roman"/>
+          <w:color w:val="auto"/>
+        </w:rPr>
+        <w:t>.</w:t>
       </w:r>
     </w:p>
     <w:p>
@@ -1368,19 +1150,51 @@
         <w:pStyle w:val="ListParagraph"/>
         <w:numPr>
           <w:ilvl w:val="0"/>
-          <w:numId w:val="3"/>
+          <w:numId w:val="14"/>
         </w:numPr>
-        <w:rPr>
-          <w:rFonts w:cs="Times New Roman"/>
-          <w:color w:val="auto"/>
-        </w:rPr>
-      </w:pPr>
-      <w:r>
-        <w:rPr>
-          <w:rFonts w:cs="Times New Roman"/>
-          <w:color w:val="auto"/>
-        </w:rPr>
-        <w:t>Certain cart-related UI components behave unresponsively when clicking buttons.</w:t>
+        <w:spacing w:line="360" w:lineRule="auto"/>
+        <w:jc w:val="both"/>
+        <w:rPr>
+          <w:rFonts w:cs="Times New Roman"/>
+          <w:color w:val="auto"/>
+        </w:rPr>
+      </w:pPr>
+      <w:r>
+        <w:rPr>
+          <w:rFonts w:cs="Times New Roman"/>
+          <w:color w:val="auto"/>
+        </w:rPr>
+        <w:t xml:space="preserve">Incorrect functioning of form input </w:t>
+      </w:r>
+      <w:r>
+        <w:rPr>
+          <w:rFonts w:cs="Times New Roman"/>
+          <w:color w:val="auto"/>
+        </w:rPr>
+        <w:t xml:space="preserve">fields for </w:t>
+      </w:r>
+      <w:r>
+        <w:rPr>
+          <w:rFonts w:cs="Times New Roman"/>
+          <w:color w:val="auto"/>
+        </w:rPr>
+        <w:t xml:space="preserve"> </w:t>
+      </w:r>
+      <w:proofErr w:type="spellStart"/>
+      <w:r>
+        <w:rPr>
+          <w:rFonts w:cs="Times New Roman"/>
+          <w:color w:val="auto"/>
+        </w:rPr>
+        <w:t>problem_user</w:t>
+      </w:r>
+      <w:proofErr w:type="spellEnd"/>
+      <w:r>
+        <w:rPr>
+          <w:rFonts w:cs="Times New Roman"/>
+          <w:color w:val="auto"/>
+        </w:rPr>
+        <w:t>.</w:t>
       </w:r>
     </w:p>
     <w:p>
@@ -1388,19 +1202,51 @@
         <w:pStyle w:val="ListParagraph"/>
         <w:numPr>
           <w:ilvl w:val="0"/>
-          <w:numId w:val="3"/>
+          <w:numId w:val="14"/>
         </w:numPr>
-        <w:rPr>
-          <w:rFonts w:cs="Times New Roman"/>
-          <w:color w:val="auto"/>
-        </w:rPr>
-      </w:pPr>
-      <w:r>
-        <w:rPr>
-          <w:rFonts w:cs="Times New Roman"/>
-          <w:color w:val="auto"/>
-        </w:rPr>
-        <w:t>Errors display appropriately but can be more visually distinct.</w:t>
+        <w:spacing w:line="360" w:lineRule="auto"/>
+        <w:jc w:val="both"/>
+        <w:rPr>
+          <w:rFonts w:cs="Times New Roman"/>
+          <w:color w:val="auto"/>
+        </w:rPr>
+      </w:pPr>
+      <w:r>
+        <w:rPr>
+          <w:rFonts w:cs="Times New Roman"/>
+          <w:color w:val="auto"/>
+        </w:rPr>
+        <w:t>Most</w:t>
+      </w:r>
+      <w:r>
+        <w:rPr>
+          <w:rFonts w:cs="Times New Roman"/>
+          <w:color w:val="auto"/>
+        </w:rPr>
+        <w:t xml:space="preserve"> </w:t>
+      </w:r>
+      <w:proofErr w:type="spellStart"/>
+      <w:r>
+        <w:rPr>
+          <w:rFonts w:cs="Times New Roman"/>
+          <w:color w:val="auto"/>
+        </w:rPr>
+        <w:t>standard_user</w:t>
+      </w:r>
+      <w:proofErr w:type="spellEnd"/>
+      <w:r>
+        <w:rPr>
+          <w:rFonts w:cs="Times New Roman"/>
+          <w:color w:val="auto"/>
+        </w:rPr>
+        <w:t xml:space="preserve"> test cases have been completed successfully</w:t>
+      </w:r>
+      <w:r>
+        <w:rPr>
+          <w:rFonts w:cs="Times New Roman"/>
+          <w:color w:val="auto"/>
+        </w:rPr>
+        <w:t>.</w:t>
       </w:r>
     </w:p>
     <w:p>
@@ -1408,19 +1254,73 @@
         <w:pStyle w:val="ListParagraph"/>
         <w:numPr>
           <w:ilvl w:val="0"/>
-          <w:numId w:val="3"/>
+          <w:numId w:val="14"/>
         </w:numPr>
-        <w:rPr>
-          <w:rFonts w:cs="Times New Roman"/>
-          <w:color w:val="auto"/>
-        </w:rPr>
-      </w:pPr>
-      <w:r>
-        <w:rPr>
-          <w:rFonts w:cs="Times New Roman"/>
-          <w:color w:val="auto"/>
-        </w:rPr>
-        <w:t>The checkout process is easy and intuitive.</w:t>
+        <w:spacing w:line="360" w:lineRule="auto"/>
+        <w:jc w:val="both"/>
+        <w:rPr>
+          <w:rFonts w:cs="Times New Roman"/>
+          <w:color w:val="auto"/>
+        </w:rPr>
+      </w:pPr>
+      <w:r>
+        <w:rPr>
+          <w:rFonts w:cs="Times New Roman"/>
+          <w:color w:val="auto"/>
+        </w:rPr>
+        <w:t xml:space="preserve">“Checkout” button floated top right on </w:t>
+      </w:r>
+      <w:proofErr w:type="spellStart"/>
+      <w:r>
+        <w:rPr>
+          <w:rFonts w:cs="Times New Roman"/>
+          <w:color w:val="auto"/>
+        </w:rPr>
+        <w:t>visual_user</w:t>
+      </w:r>
+      <w:proofErr w:type="spellEnd"/>
+      <w:r>
+        <w:rPr>
+          <w:rFonts w:cs="Times New Roman"/>
+          <w:color w:val="auto"/>
+        </w:rPr>
+        <w:t xml:space="preserve"> profile</w:t>
+      </w:r>
+    </w:p>
+    <w:p>
+      <w:pPr>
+        <w:pStyle w:val="Heading2"/>
+        <w:jc w:val="both"/>
+        <w:rPr>
+          <w:rFonts w:ascii="Times New Roman" w:hAnsi="Times New Roman" w:cs="Times New Roman"/>
+          <w:color w:val="auto"/>
+        </w:rPr>
+      </w:pPr>
+      <w:bookmarkStart w:id="2" w:name="_Toc228200742"/>
+      <w:r>
+        <w:rPr>
+          <w:rFonts w:ascii="Times New Roman" w:hAnsi="Times New Roman" w:cs="Times New Roman"/>
+          <w:color w:val="auto"/>
+        </w:rPr>
+        <w:t>Release blockers</w:t>
+      </w:r>
+      <w:bookmarkEnd w:id="2"/>
+    </w:p>
+    <w:p>
+      <w:pPr>
+        <w:spacing w:line="360" w:lineRule="auto"/>
+        <w:jc w:val="both"/>
+        <w:rPr>
+          <w:rFonts w:cs="Times New Roman"/>
+          <w:color w:val="auto"/>
+        </w:rPr>
+      </w:pPr>
+      <w:r>
+        <w:rPr>
+          <w:rFonts w:cs="Times New Roman"/>
+          <w:color w:val="auto"/>
+        </w:rPr>
+        <w:t>The following defects were identified as potential release blockers due to their impact on core application functionality:</w:t>
       </w:r>
     </w:p>
     <w:p>
@@ -1428,8 +1328,517 @@
         <w:pStyle w:val="ListParagraph"/>
         <w:numPr>
           <w:ilvl w:val="0"/>
-          <w:numId w:val="3"/>
+          <w:numId w:val="8"/>
         </w:numPr>
+        <w:spacing w:line="360" w:lineRule="auto"/>
+        <w:jc w:val="both"/>
+        <w:rPr>
+          <w:rFonts w:cs="Times New Roman"/>
+          <w:color w:val="auto"/>
+        </w:rPr>
+      </w:pPr>
+      <w:r>
+        <w:rPr>
+          <w:rFonts w:cs="Times New Roman"/>
+          <w:color w:val="auto"/>
+        </w:rPr>
+        <w:t>Sorting functionality failure when selecting price-based sorting options</w:t>
+      </w:r>
+      <w:r>
+        <w:rPr>
+          <w:rFonts w:cs="Times New Roman"/>
+          <w:color w:val="auto"/>
+        </w:rPr>
+        <w:t xml:space="preserve"> for</w:t>
+      </w:r>
+      <w:r>
+        <w:rPr>
+          <w:rFonts w:cs="Times New Roman"/>
+          <w:color w:val="auto"/>
+        </w:rPr>
+        <w:t xml:space="preserve"> </w:t>
+      </w:r>
+      <w:proofErr w:type="spellStart"/>
+      <w:r>
+        <w:rPr>
+          <w:rFonts w:cs="Times New Roman"/>
+          <w:color w:val="auto"/>
+        </w:rPr>
+        <w:t>problem_user</w:t>
+      </w:r>
+      <w:proofErr w:type="spellEnd"/>
+      <w:r>
+        <w:rPr>
+          <w:rFonts w:cs="Times New Roman"/>
+          <w:color w:val="auto"/>
+        </w:rPr>
+        <w:t xml:space="preserve">.  </w:t>
+      </w:r>
+      <w:r>
+        <w:rPr>
+          <w:rFonts w:cs="Times New Roman"/>
+          <w:color w:val="auto"/>
+        </w:rPr>
+        <w:t xml:space="preserve"> </w:t>
+      </w:r>
+    </w:p>
+    <w:p>
+      <w:pPr>
+        <w:pStyle w:val="ListParagraph"/>
+        <w:numPr>
+          <w:ilvl w:val="0"/>
+          <w:numId w:val="8"/>
+        </w:numPr>
+        <w:spacing w:line="360" w:lineRule="auto"/>
+        <w:jc w:val="both"/>
+        <w:rPr>
+          <w:rFonts w:cs="Times New Roman"/>
+          <w:color w:val="auto"/>
+        </w:rPr>
+      </w:pPr>
+      <w:r>
+        <w:rPr>
+          <w:rFonts w:cs="Times New Roman"/>
+          <w:color w:val="auto"/>
+        </w:rPr>
+        <w:t>Add to Cart button failing to add items to the cart</w:t>
+      </w:r>
+      <w:r>
+        <w:rPr>
+          <w:rFonts w:cs="Times New Roman"/>
+          <w:color w:val="auto"/>
+        </w:rPr>
+        <w:t xml:space="preserve"> for </w:t>
+      </w:r>
+      <w:proofErr w:type="spellStart"/>
+      <w:r>
+        <w:rPr>
+          <w:rFonts w:cs="Times New Roman"/>
+          <w:color w:val="auto"/>
+        </w:rPr>
+        <w:t>problem_user</w:t>
+      </w:r>
+      <w:proofErr w:type="spellEnd"/>
+      <w:r>
+        <w:rPr>
+          <w:rFonts w:cs="Times New Roman"/>
+          <w:color w:val="auto"/>
+        </w:rPr>
+        <w:t xml:space="preserve">.  </w:t>
+      </w:r>
+    </w:p>
+    <w:p>
+      <w:pPr>
+        <w:pStyle w:val="ListParagraph"/>
+        <w:numPr>
+          <w:ilvl w:val="0"/>
+          <w:numId w:val="8"/>
+        </w:numPr>
+        <w:spacing w:line="360" w:lineRule="auto"/>
+        <w:jc w:val="both"/>
+        <w:rPr>
+          <w:rFonts w:cs="Times New Roman"/>
+          <w:color w:val="auto"/>
+        </w:rPr>
+      </w:pPr>
+      <w:r>
+        <w:rPr>
+          <w:rFonts w:cs="Times New Roman"/>
+          <w:color w:val="auto"/>
+        </w:rPr>
+        <w:t>Remove button failing to remove items from the cart</w:t>
+      </w:r>
+      <w:r>
+        <w:rPr>
+          <w:rFonts w:cs="Times New Roman"/>
+          <w:color w:val="auto"/>
+        </w:rPr>
+        <w:t xml:space="preserve"> for </w:t>
+      </w:r>
+      <w:proofErr w:type="spellStart"/>
+      <w:r>
+        <w:rPr>
+          <w:rFonts w:cs="Times New Roman"/>
+          <w:color w:val="auto"/>
+        </w:rPr>
+        <w:t>problem_user</w:t>
+      </w:r>
+      <w:proofErr w:type="spellEnd"/>
+      <w:r>
+        <w:rPr>
+          <w:rFonts w:cs="Times New Roman"/>
+          <w:color w:val="auto"/>
+        </w:rPr>
+        <w:t xml:space="preserve">.  </w:t>
+      </w:r>
+    </w:p>
+    <w:p>
+      <w:pPr>
+        <w:pStyle w:val="ListParagraph"/>
+        <w:numPr>
+          <w:ilvl w:val="0"/>
+          <w:numId w:val="8"/>
+        </w:numPr>
+        <w:spacing w:line="360" w:lineRule="auto"/>
+        <w:jc w:val="both"/>
+        <w:rPr>
+          <w:rFonts w:cs="Times New Roman"/>
+          <w:color w:val="auto"/>
+        </w:rPr>
+      </w:pPr>
+      <w:r>
+        <w:rPr>
+          <w:rFonts w:cs="Times New Roman"/>
+          <w:color w:val="auto"/>
+        </w:rPr>
+        <w:t xml:space="preserve">Enter </w:t>
+      </w:r>
+      <w:r>
+        <w:rPr>
+          <w:rFonts w:cs="Times New Roman"/>
+          <w:color w:val="auto"/>
+        </w:rPr>
+        <w:t>“</w:t>
+      </w:r>
+      <w:r>
+        <w:rPr>
+          <w:rFonts w:cs="Times New Roman"/>
+          <w:color w:val="auto"/>
+        </w:rPr>
+        <w:t>your details form</w:t>
+      </w:r>
+      <w:r>
+        <w:rPr>
+          <w:rFonts w:cs="Times New Roman"/>
+          <w:color w:val="auto"/>
+        </w:rPr>
+        <w:t>”</w:t>
+      </w:r>
+      <w:r>
+        <w:rPr>
+          <w:rFonts w:cs="Times New Roman"/>
+          <w:color w:val="auto"/>
+        </w:rPr>
+        <w:t xml:space="preserve"> input field synchronization issue</w:t>
+      </w:r>
+      <w:r>
+        <w:rPr>
+          <w:rFonts w:cs="Times New Roman"/>
+          <w:color w:val="auto"/>
+        </w:rPr>
+        <w:t>s</w:t>
+      </w:r>
+      <w:r>
+        <w:rPr>
+          <w:rFonts w:cs="Times New Roman"/>
+          <w:color w:val="auto"/>
+        </w:rPr>
+        <w:t xml:space="preserve"> for </w:t>
+      </w:r>
+      <w:proofErr w:type="spellStart"/>
+      <w:r>
+        <w:rPr>
+          <w:rFonts w:cs="Times New Roman"/>
+          <w:color w:val="auto"/>
+        </w:rPr>
+        <w:t>problem_user</w:t>
+      </w:r>
+      <w:proofErr w:type="spellEnd"/>
+      <w:r>
+        <w:rPr>
+          <w:rFonts w:cs="Times New Roman"/>
+          <w:color w:val="auto"/>
+        </w:rPr>
+        <w:t>.</w:t>
+      </w:r>
+    </w:p>
+    <w:p>
+      <w:pPr>
+        <w:pStyle w:val="ListParagraph"/>
+        <w:numPr>
+          <w:ilvl w:val="0"/>
+          <w:numId w:val="8"/>
+        </w:numPr>
+        <w:spacing w:line="360" w:lineRule="auto"/>
+        <w:jc w:val="both"/>
+        <w:rPr>
+          <w:rFonts w:cs="Times New Roman"/>
+          <w:color w:val="auto"/>
+        </w:rPr>
+      </w:pPr>
+      <w:r>
+        <w:rPr>
+          <w:rFonts w:cs="Times New Roman"/>
+          <w:color w:val="auto"/>
+        </w:rPr>
+        <w:t>Sometimes</w:t>
+      </w:r>
+      <w:r>
+        <w:rPr>
+          <w:rFonts w:cs="Times New Roman"/>
+          <w:color w:val="auto"/>
+        </w:rPr>
+        <w:t xml:space="preserve"> total value doesn’t get rounded to two decimal places.</w:t>
+      </w:r>
+    </w:p>
+    <w:p>
+      <w:pPr>
+        <w:spacing w:line="360" w:lineRule="auto"/>
+        <w:jc w:val="both"/>
+        <w:rPr>
+          <w:rFonts w:cs="Times New Roman"/>
+          <w:color w:val="auto"/>
+        </w:rPr>
+      </w:pPr>
+      <w:r>
+        <w:rPr>
+          <w:rFonts w:cs="Times New Roman"/>
+          <w:color w:val="auto"/>
+        </w:rPr>
+        <w:t>These defects impact the core shopping workflow and must be resolved before releasing the application to end users.</w:t>
+      </w:r>
+    </w:p>
+    <w:p>
+      <w:pPr>
+        <w:pStyle w:val="Heading2"/>
+        <w:jc w:val="both"/>
+        <w:rPr>
+          <w:rFonts w:ascii="Times New Roman" w:hAnsi="Times New Roman" w:cs="Times New Roman"/>
+          <w:color w:val="auto"/>
+        </w:rPr>
+      </w:pPr>
+      <w:bookmarkStart w:id="3" w:name="_Toc228200743"/>
+      <w:r>
+        <w:rPr>
+          <w:rFonts w:ascii="Times New Roman" w:hAnsi="Times New Roman" w:cs="Times New Roman"/>
+          <w:color w:val="auto"/>
+        </w:rPr>
+        <w:t>UX observations</w:t>
+      </w:r>
+      <w:bookmarkEnd w:id="3"/>
+    </w:p>
+    <w:p>
+      <w:pPr>
+        <w:pStyle w:val="ListParagraph"/>
+        <w:numPr>
+          <w:ilvl w:val="0"/>
+          <w:numId w:val="10"/>
+        </w:numPr>
+        <w:spacing w:line="360" w:lineRule="auto"/>
+        <w:jc w:val="both"/>
+        <w:rPr>
+          <w:rFonts w:cs="Times New Roman"/>
+          <w:color w:val="auto"/>
+        </w:rPr>
+      </w:pPr>
+      <w:r>
+        <w:rPr>
+          <w:rFonts w:cs="Times New Roman"/>
+          <w:color w:val="auto"/>
+        </w:rPr>
+        <w:t>The Filter dropdown arrow does not work upon clicking</w:t>
+      </w:r>
+      <w:r>
+        <w:rPr>
+          <w:rFonts w:cs="Times New Roman"/>
+          <w:color w:val="auto"/>
+        </w:rPr>
+        <w:t xml:space="preserve"> right on the arrow icon</w:t>
+      </w:r>
+      <w:r>
+        <w:rPr>
+          <w:rFonts w:cs="Times New Roman"/>
+          <w:color w:val="auto"/>
+        </w:rPr>
+        <w:t xml:space="preserve">(Even though the mouse </w:t>
+      </w:r>
+      <w:r>
+        <w:rPr>
+          <w:rFonts w:cs="Times New Roman"/>
+          <w:color w:val="auto"/>
+        </w:rPr>
+        <w:t>indicates a clickable area</w:t>
+      </w:r>
+      <w:r>
+        <w:rPr>
+          <w:rFonts w:cs="Times New Roman"/>
+          <w:color w:val="auto"/>
+        </w:rPr>
+        <w:t>)</w:t>
+      </w:r>
+      <w:r>
+        <w:rPr>
+          <w:rFonts w:cs="Times New Roman"/>
+          <w:color w:val="auto"/>
+        </w:rPr>
+        <w:t xml:space="preserve"> and</w:t>
+      </w:r>
+      <w:r>
+        <w:rPr>
+          <w:rFonts w:cs="Times New Roman"/>
+          <w:color w:val="auto"/>
+        </w:rPr>
+        <w:t xml:space="preserve"> requires clicking directly on the dropdown filter bar.</w:t>
+      </w:r>
+    </w:p>
+    <w:p>
+      <w:pPr>
+        <w:pStyle w:val="ListParagraph"/>
+        <w:numPr>
+          <w:ilvl w:val="0"/>
+          <w:numId w:val="10"/>
+        </w:numPr>
+        <w:spacing w:line="360" w:lineRule="auto"/>
+        <w:jc w:val="both"/>
+        <w:rPr>
+          <w:rFonts w:cs="Times New Roman"/>
+          <w:color w:val="auto"/>
+        </w:rPr>
+      </w:pPr>
+      <w:r>
+        <w:rPr>
+          <w:rFonts w:cs="Times New Roman"/>
+          <w:color w:val="auto"/>
+        </w:rPr>
+        <w:t xml:space="preserve">There is an alignment issue with the Checkout button on the Cart page when logged in as </w:t>
+      </w:r>
+      <w:proofErr w:type="spellStart"/>
+      <w:r>
+        <w:rPr>
+          <w:rFonts w:cs="Times New Roman"/>
+          <w:color w:val="auto"/>
+        </w:rPr>
+        <w:t>visual_user</w:t>
+      </w:r>
+      <w:proofErr w:type="spellEnd"/>
+      <w:r>
+        <w:rPr>
+          <w:rFonts w:cs="Times New Roman"/>
+          <w:color w:val="auto"/>
+        </w:rPr>
+        <w:t xml:space="preserve">(“Checkout” button floated top right on </w:t>
+      </w:r>
+      <w:proofErr w:type="spellStart"/>
+      <w:r>
+        <w:rPr>
+          <w:rFonts w:cs="Times New Roman"/>
+          <w:color w:val="auto"/>
+        </w:rPr>
+        <w:t>visual_user</w:t>
+      </w:r>
+      <w:proofErr w:type="spellEnd"/>
+      <w:r>
+        <w:rPr>
+          <w:rFonts w:cs="Times New Roman"/>
+          <w:color w:val="auto"/>
+        </w:rPr>
+        <w:t xml:space="preserve"> profile)</w:t>
+      </w:r>
+      <w:r>
+        <w:rPr>
+          <w:rFonts w:cs="Times New Roman"/>
+          <w:color w:val="auto"/>
+        </w:rPr>
+        <w:t>.</w:t>
+      </w:r>
+    </w:p>
+    <w:p>
+      <w:pPr>
+        <w:pStyle w:val="ListParagraph"/>
+        <w:numPr>
+          <w:ilvl w:val="0"/>
+          <w:numId w:val="10"/>
+        </w:numPr>
+        <w:spacing w:line="360" w:lineRule="auto"/>
+        <w:jc w:val="both"/>
+        <w:rPr>
+          <w:rFonts w:cs="Times New Roman"/>
+          <w:color w:val="auto"/>
+        </w:rPr>
+      </w:pPr>
+      <w:r>
+        <w:rPr>
+          <w:rFonts w:cs="Times New Roman"/>
+          <w:color w:val="auto"/>
+        </w:rPr>
+        <w:t>The sidebar hides the footer contents by overlapping it.</w:t>
+      </w:r>
+    </w:p>
+    <w:p>
+      <w:pPr>
+        <w:pStyle w:val="ListParagraph"/>
+        <w:numPr>
+          <w:ilvl w:val="0"/>
+          <w:numId w:val="10"/>
+        </w:numPr>
+        <w:spacing w:line="360" w:lineRule="auto"/>
+        <w:jc w:val="both"/>
+        <w:rPr>
+          <w:rFonts w:cs="Times New Roman"/>
+          <w:color w:val="auto"/>
+        </w:rPr>
+      </w:pPr>
+      <w:r>
+        <w:rPr>
+          <w:rFonts w:cs="Times New Roman"/>
+          <w:color w:val="auto"/>
+        </w:rPr>
+        <w:t>Certain cart-related UI components behave unresponsively when clicking buttons.</w:t>
+      </w:r>
+    </w:p>
+    <w:p>
+      <w:pPr>
+        <w:pStyle w:val="ListParagraph"/>
+        <w:numPr>
+          <w:ilvl w:val="0"/>
+          <w:numId w:val="10"/>
+        </w:numPr>
+        <w:spacing w:line="360" w:lineRule="auto"/>
+        <w:jc w:val="both"/>
+        <w:rPr>
+          <w:rFonts w:cs="Times New Roman"/>
+          <w:color w:val="auto"/>
+        </w:rPr>
+      </w:pPr>
+      <w:r>
+        <w:rPr>
+          <w:rFonts w:cs="Times New Roman"/>
+          <w:color w:val="auto"/>
+        </w:rPr>
+        <w:t>Errors display appropriately but can be more visually distinct.</w:t>
+      </w:r>
+    </w:p>
+    <w:p>
+      <w:pPr>
+        <w:pStyle w:val="ListParagraph"/>
+        <w:numPr>
+          <w:ilvl w:val="0"/>
+          <w:numId w:val="10"/>
+        </w:numPr>
+        <w:spacing w:line="360" w:lineRule="auto"/>
+        <w:jc w:val="both"/>
+        <w:rPr>
+          <w:rFonts w:cs="Times New Roman"/>
+          <w:color w:val="auto"/>
+        </w:rPr>
+      </w:pPr>
+      <w:r>
+        <w:rPr>
+          <w:rFonts w:cs="Times New Roman"/>
+          <w:color w:val="auto"/>
+        </w:rPr>
+        <w:t>The checkout process is easy and intuitive.</w:t>
+      </w:r>
+    </w:p>
+    <w:p>
+      <w:pPr>
+        <w:pStyle w:val="ListParagraph"/>
+        <w:numPr>
+          <w:ilvl w:val="0"/>
+          <w:numId w:val="10"/>
+        </w:numPr>
+        <w:spacing w:line="360" w:lineRule="auto"/>
+        <w:jc w:val="both"/>
         <w:rPr>
           <w:rFonts w:cs="Times New Roman"/>
           <w:color w:val="auto"/>
@@ -1444,8 +1853,8 @@
       </w:r>
     </w:p>
     <w:sectPr>
-      <w:headerReference w:type="default" r:id="rId6"/>
-      <w:footerReference w:type="default" r:id="rId7"/>
+      <w:headerReference w:type="default" r:id="rId8"/>
+      <w:footerReference w:type="default" r:id="rId9"/>
       <w:pgSz w:w="11906" w:h="16838"/>
       <w:pgMar w:top="1440" w:right="1080" w:bottom="1440" w:left="1080" w:header="708" w:footer="708" w:gutter="0"/>
       <w:pgBorders w:offsetFrom="page">
@@ -1460,6 +1869,31 @@
     </w:sectPr>
   </w:body>
 </w:document>
+</file>
+
+<file path=word/endnotes.xml><?xml version="1.0" encoding="utf-8"?>
+<w:endnotes xmlns:wpc="http://schemas.microsoft.com/office/word/2010/wordprocessingCanvas" xmlns:cx="http://schemas.microsoft.com/office/drawing/2014/chartex" xmlns:cx1="http://schemas.microsoft.com/office/drawing/2015/9/8/chartex" xmlns:cx2="http://schemas.microsoft.com/office/drawing/2015/10/21/chartex" xmlns:cx3="http://schemas.microsoft.com/office/drawing/2016/5/9/chartex" xmlns:cx4="http://schemas.microsoft.com/office/drawing/2016/5/10/chartex" xmlns:cx5="http://schemas.microsoft.com/office/drawing/2016/5/11/chartex" xmlns:cx6="http://schemas.microsoft.com/office/drawing/2016/5/12/chartex" xmlns:cx7="http://schemas.microsoft.com/office/drawing/2016/5/13/chartex" xmlns:cx8="http://schemas.microsoft.com/office/drawing/2016/5/14/chartex" xmlns:mc="http://schemas.openxmlformats.org/markup-compatibility/2006" xmlns:aink="http://schemas.microsoft.com/office/drawing/2016/ink" xmlns:am3d="http://schemas.microsoft.com/office/drawing/2017/model3d" xmlns:o="urn:schemas-microsoft-com:office:office" xmlns:oel="http://schemas.microsoft.com/office/2019/extlst" xmlns:r="http://schemas.openxmlformats.org/officeDocument/2006/relationships" xmlns:m="http://schemas.openxmlformats.org/officeDocument/2006/math" xmlns:v="urn:schemas-microsoft-com:vml" xmlns:wp14="http://schemas.microsoft.com/office/word/2010/wordprocessingDrawing" xmlns:wp="http://schemas.openxmlformats.org/drawingml/2006/wordprocessingDrawing" xmlns:w10="urn:schemas-microsoft-com:office:word" xmlns:w="http://schemas.openxmlformats.org/wordprocessingml/2006/main" xmlns:w14="http://schemas.microsoft.com/office/word/2010/wordml" xmlns:w15="http://schemas.microsoft.com/office/word/2012/wordml" xmlns:w16cex="http://schemas.microsoft.com/office/word/2018/wordml/cex" xmlns:w16cid="http://schemas.microsoft.com/office/word/2016/wordml/cid" xmlns:w16="http://schemas.microsoft.com/office/word/2018/wordml" xmlns:w16du="http://schemas.microsoft.com/office/word/2023/wordml/word16du" xmlns:w16sdtdh="http://schemas.microsoft.com/office/word/2020/wordml/sdtdatahash" xmlns:w16sdtfl="http://schemas.microsoft.com/office/word/2024/wordml/sdtformatlock" xmlns:w16se="http://schemas.microsoft.com/office/word/2015/wordml/symex" xmlns:wpg="http://schemas.microsoft.com/office/word/2010/wordprocessingGroup" xmlns:wpi="http://schemas.microsoft.com/office/word/2010/wordprocessingInk" xmlns:wne="http://schemas.microsoft.com/office/word/2006/wordml" xmlns:wps="http://schemas.microsoft.com/office/word/2010/wordprocessingShape" mc:Ignorable="w14 w15 w16se w16cid w16 w16cex w16sdtdh w16sdtfl w16du wp14">
+  <w:endnote w:type="separator" w:id="-1">
+    <w:p>
+      <w:pPr>
+        <w:spacing w:before="0" w:after="0" w:line="240" w:lineRule="auto"/>
+      </w:pPr>
+      <w:r>
+        <w:separator/>
+      </w:r>
+    </w:p>
+  </w:endnote>
+  <w:endnote w:type="continuationSeparator" w:id="0">
+    <w:p>
+      <w:pPr>
+        <w:spacing w:before="0" w:after="0" w:line="240" w:lineRule="auto"/>
+      </w:pPr>
+      <w:r>
+        <w:continuationSeparator/>
+      </w:r>
+    </w:p>
+  </w:endnote>
+</w:endnotes>
 </file>
 
 <file path=word/footer1.xml><?xml version="1.0" encoding="utf-8"?>
@@ -1520,6 +1954,31 @@
 </w:ftr>
 </file>
 
+<file path=word/footnotes.xml><?xml version="1.0" encoding="utf-8"?>
+<w:footnotes xmlns:wpc="http://schemas.microsoft.com/office/word/2010/wordprocessingCanvas" xmlns:cx="http://schemas.microsoft.com/office/drawing/2014/chartex" xmlns:cx1="http://schemas.microsoft.com/office/drawing/2015/9/8/chartex" xmlns:cx2="http://schemas.microsoft.com/office/drawing/2015/10/21/chartex" xmlns:cx3="http://schemas.microsoft.com/office/drawing/2016/5/9/chartex" xmlns:cx4="http://schemas.microsoft.com/office/drawing/2016/5/10/chartex" xmlns:cx5="http://schemas.microsoft.com/office/drawing/2016/5/11/chartex" xmlns:cx6="http://schemas.microsoft.com/office/drawing/2016/5/12/chartex" xmlns:cx7="http://schemas.microsoft.com/office/drawing/2016/5/13/chartex" xmlns:cx8="http://schemas.microsoft.com/office/drawing/2016/5/14/chartex" xmlns:mc="http://schemas.openxmlformats.org/markup-compatibility/2006" xmlns:aink="http://schemas.microsoft.com/office/drawing/2016/ink" xmlns:am3d="http://schemas.microsoft.com/office/drawing/2017/model3d" xmlns:o="urn:schemas-microsoft-com:office:office" xmlns:oel="http://schemas.microsoft.com/office/2019/extlst" xmlns:r="http://schemas.openxmlformats.org/officeDocument/2006/relationships" xmlns:m="http://schemas.openxmlformats.org/officeDocument/2006/math" xmlns:v="urn:schemas-microsoft-com:vml" xmlns:wp14="http://schemas.microsoft.com/office/word/2010/wordprocessingDrawing" xmlns:wp="http://schemas.openxmlformats.org/drawingml/2006/wordprocessingDrawing" xmlns:w10="urn:schemas-microsoft-com:office:word" xmlns:w="http://schemas.openxmlformats.org/wordprocessingml/2006/main" xmlns:w14="http://schemas.microsoft.com/office/word/2010/wordml" xmlns:w15="http://schemas.microsoft.com/office/word/2012/wordml" xmlns:w16cex="http://schemas.microsoft.com/office/word/2018/wordml/cex" xmlns:w16cid="http://schemas.microsoft.com/office/word/2016/wordml/cid" xmlns:w16="http://schemas.microsoft.com/office/word/2018/wordml" xmlns:w16du="http://schemas.microsoft.com/office/word/2023/wordml/word16du" xmlns:w16sdtdh="http://schemas.microsoft.com/office/word/2020/wordml/sdtdatahash" xmlns:w16sdtfl="http://schemas.microsoft.com/office/word/2024/wordml/sdtformatlock" xmlns:w16se="http://schemas.microsoft.com/office/word/2015/wordml/symex" xmlns:wpg="http://schemas.microsoft.com/office/word/2010/wordprocessingGroup" xmlns:wpi="http://schemas.microsoft.com/office/word/2010/wordprocessingInk" xmlns:wne="http://schemas.microsoft.com/office/word/2006/wordml" xmlns:wps="http://schemas.microsoft.com/office/word/2010/wordprocessingShape" mc:Ignorable="w14 w15 w16se w16cid w16 w16cex w16sdtdh w16sdtfl w16du wp14">
+  <w:footnote w:type="separator" w:id="-1">
+    <w:p>
+      <w:pPr>
+        <w:spacing w:before="0" w:after="0" w:line="240" w:lineRule="auto"/>
+      </w:pPr>
+      <w:r>
+        <w:separator/>
+      </w:r>
+    </w:p>
+  </w:footnote>
+  <w:footnote w:type="continuationSeparator" w:id="0">
+    <w:p>
+      <w:pPr>
+        <w:spacing w:before="0" w:after="0" w:line="240" w:lineRule="auto"/>
+      </w:pPr>
+      <w:r>
+        <w:continuationSeparator/>
+      </w:r>
+    </w:p>
+  </w:footnote>
+</w:footnotes>
+</file>
+
 <file path=word/header1.xml><?xml version="1.0" encoding="utf-8"?>
 <w:hdr xmlns:wpc="http://schemas.microsoft.com/office/word/2010/wordprocessingCanvas" xmlns:cx="http://schemas.microsoft.com/office/drawing/2014/chartex" xmlns:cx1="http://schemas.microsoft.com/office/drawing/2015/9/8/chartex" xmlns:cx2="http://schemas.microsoft.com/office/drawing/2015/10/21/chartex" xmlns:cx3="http://schemas.microsoft.com/office/drawing/2016/5/9/chartex" xmlns:cx4="http://schemas.microsoft.com/office/drawing/2016/5/10/chartex" xmlns:cx5="http://schemas.microsoft.com/office/drawing/2016/5/11/chartex" xmlns:cx6="http://schemas.microsoft.com/office/drawing/2016/5/12/chartex" xmlns:cx7="http://schemas.microsoft.com/office/drawing/2016/5/13/chartex" xmlns:cx8="http://schemas.microsoft.com/office/drawing/2016/5/14/chartex" xmlns:mc="http://schemas.openxmlformats.org/markup-compatibility/2006" xmlns:aink="http://schemas.microsoft.com/office/drawing/2016/ink" xmlns:am3d="http://schemas.microsoft.com/office/drawing/2017/model3d" xmlns:o="urn:schemas-microsoft-com:office:office" xmlns:oel="http://schemas.microsoft.com/office/2019/extlst" xmlns:r="http://schemas.openxmlformats.org/officeDocument/2006/relationships" xmlns:m="http://schemas.openxmlformats.org/officeDocument/2006/math" xmlns:v="urn:schemas-microsoft-com:vml" xmlns:wp14="http://schemas.microsoft.com/office/word/2010/wordprocessingDrawing" xmlns:wp="http://schemas.openxmlformats.org/drawingml/2006/wordprocessingDrawing" xmlns:w10="urn:schemas-microsoft-com:office:word" xmlns:w="http://schemas.openxmlformats.org/wordprocessingml/2006/main" xmlns:w14="http://schemas.microsoft.com/office/word/2010/wordml" xmlns:w15="http://schemas.microsoft.com/office/word/2012/wordml" xmlns:w16cex="http://schemas.microsoft.com/office/word/2018/wordml/cex" xmlns:w16cid="http://schemas.microsoft.com/office/word/2016/wordml/cid" xmlns:w16="http://schemas.microsoft.com/office/word/2018/wordml" xmlns:w16du="http://schemas.microsoft.com/office/word/2023/wordml/word16du" xmlns:w16sdtdh="http://schemas.microsoft.com/office/word/2020/wordml/sdtdatahash" xmlns:w16sdtfl="http://schemas.microsoft.com/office/word/2024/wordml/sdtformatlock" xmlns:w16se="http://schemas.microsoft.com/office/word/2015/wordml/symex" xmlns:wpg="http://schemas.microsoft.com/office/word/2010/wordprocessingGroup" xmlns:wpi="http://schemas.microsoft.com/office/word/2010/wordprocessingInk" xmlns:wne="http://schemas.microsoft.com/office/word/2006/wordml" xmlns:wps="http://schemas.microsoft.com/office/word/2010/wordprocessingShape" mc:Ignorable="w14 w15 w16se w16cid w16 w16cex w16sdtdh w16sdtfl w16du wp14">
   <w:p>
@@ -1533,6 +1992,119 @@
 <file path=word/numbering.xml><?xml version="1.0" encoding="utf-8"?>
 <w:numbering xmlns:wpc="http://schemas.microsoft.com/office/word/2010/wordprocessingCanvas" xmlns:cx="http://schemas.microsoft.com/office/drawing/2014/chartex" xmlns:cx1="http://schemas.microsoft.com/office/drawing/2015/9/8/chartex" xmlns:cx2="http://schemas.microsoft.com/office/drawing/2015/10/21/chartex" xmlns:cx3="http://schemas.microsoft.com/office/drawing/2016/5/9/chartex" xmlns:cx4="http://schemas.microsoft.com/office/drawing/2016/5/10/chartex" xmlns:cx5="http://schemas.microsoft.com/office/drawing/2016/5/11/chartex" xmlns:cx6="http://schemas.microsoft.com/office/drawing/2016/5/12/chartex" xmlns:cx7="http://schemas.microsoft.com/office/drawing/2016/5/13/chartex" xmlns:cx8="http://schemas.microsoft.com/office/drawing/2016/5/14/chartex" xmlns:mc="http://schemas.openxmlformats.org/markup-compatibility/2006" xmlns:aink="http://schemas.microsoft.com/office/drawing/2016/ink" xmlns:am3d="http://schemas.microsoft.com/office/drawing/2017/model3d" xmlns:o="urn:schemas-microsoft-com:office:office" xmlns:oel="http://schemas.microsoft.com/office/2019/extlst" xmlns:r="http://schemas.openxmlformats.org/officeDocument/2006/relationships" xmlns:m="http://schemas.openxmlformats.org/officeDocument/2006/math" xmlns:v="urn:schemas-microsoft-com:vml" xmlns:wp14="http://schemas.microsoft.com/office/word/2010/wordprocessingDrawing" xmlns:wp="http://schemas.openxmlformats.org/drawingml/2006/wordprocessingDrawing" xmlns:w10="urn:schemas-microsoft-com:office:word" xmlns:w="http://schemas.openxmlformats.org/wordprocessingml/2006/main" xmlns:w14="http://schemas.microsoft.com/office/word/2010/wordml" xmlns:w15="http://schemas.microsoft.com/office/word/2012/wordml" xmlns:w16cex="http://schemas.microsoft.com/office/word/2018/wordml/cex" xmlns:w16cid="http://schemas.microsoft.com/office/word/2016/wordml/cid" xmlns:w16="http://schemas.microsoft.com/office/word/2018/wordml" xmlns:w16du="http://schemas.microsoft.com/office/word/2023/wordml/word16du" xmlns:w16sdtdh="http://schemas.microsoft.com/office/word/2020/wordml/sdtdatahash" xmlns:w16sdtfl="http://schemas.microsoft.com/office/word/2024/wordml/sdtformatlock" xmlns:w16se="http://schemas.microsoft.com/office/word/2015/wordml/symex" xmlns:wpg="http://schemas.microsoft.com/office/word/2010/wordprocessingGroup" xmlns:wpi="http://schemas.microsoft.com/office/word/2010/wordprocessingInk" xmlns:wne="http://schemas.microsoft.com/office/word/2006/wordml" xmlns:wps="http://schemas.microsoft.com/office/word/2010/wordprocessingShape" mc:Ignorable="w14 w15 w16se w16cid w16 w16cex w16sdtdh w16sdtfl w16du wp14">
   <w:abstractNum w:abstractNumId="0" w15:restartNumberingAfterBreak="0">
+    <w:nsid w:val="02FF2AFB"/>
+    <w:multiLevelType w:val="hybridMultilevel"/>
+    <w:tmpl w:val="31AAB94A"/>
+    <w:lvl w:ilvl="0" w:tplc="08090001">
+      <w:start w:val="1"/>
+      <w:numFmt w:val="bullet"/>
+      <w:lvlText w:val=""/>
+      <w:lvlJc w:val="left"/>
+      <w:pPr>
+        <w:ind w:left="720" w:hanging="360"/>
+      </w:pPr>
+      <w:rPr>
+        <w:rFonts w:ascii="Symbol" w:hAnsi="Symbol" w:hint="default"/>
+      </w:rPr>
+    </w:lvl>
+    <w:lvl w:ilvl="1" w:tplc="08090003" w:tentative="1">
+      <w:start w:val="1"/>
+      <w:numFmt w:val="bullet"/>
+      <w:lvlText w:val="o"/>
+      <w:lvlJc w:val="left"/>
+      <w:pPr>
+        <w:ind w:left="1440" w:hanging="360"/>
+      </w:pPr>
+      <w:rPr>
+        <w:rFonts w:ascii="Courier New" w:hAnsi="Courier New" w:cs="Courier New" w:hint="default"/>
+      </w:rPr>
+    </w:lvl>
+    <w:lvl w:ilvl="2" w:tplc="08090005" w:tentative="1">
+      <w:start w:val="1"/>
+      <w:numFmt w:val="bullet"/>
+      <w:lvlText w:val=""/>
+      <w:lvlJc w:val="left"/>
+      <w:pPr>
+        <w:ind w:left="2160" w:hanging="360"/>
+      </w:pPr>
+      <w:rPr>
+        <w:rFonts w:ascii="Wingdings" w:hAnsi="Wingdings" w:hint="default"/>
+      </w:rPr>
+    </w:lvl>
+    <w:lvl w:ilvl="3" w:tplc="08090001" w:tentative="1">
+      <w:start w:val="1"/>
+      <w:numFmt w:val="bullet"/>
+      <w:lvlText w:val=""/>
+      <w:lvlJc w:val="left"/>
+      <w:pPr>
+        <w:ind w:left="2880" w:hanging="360"/>
+      </w:pPr>
+      <w:rPr>
+        <w:rFonts w:ascii="Symbol" w:hAnsi="Symbol" w:hint="default"/>
+      </w:rPr>
+    </w:lvl>
+    <w:lvl w:ilvl="4" w:tplc="08090003" w:tentative="1">
+      <w:start w:val="1"/>
+      <w:numFmt w:val="bullet"/>
+      <w:lvlText w:val="o"/>
+      <w:lvlJc w:val="left"/>
+      <w:pPr>
+        <w:ind w:left="3600" w:hanging="360"/>
+      </w:pPr>
+      <w:rPr>
+        <w:rFonts w:ascii="Courier New" w:hAnsi="Courier New" w:cs="Courier New" w:hint="default"/>
+      </w:rPr>
+    </w:lvl>
+    <w:lvl w:ilvl="5" w:tplc="08090005" w:tentative="1">
+      <w:start w:val="1"/>
+      <w:numFmt w:val="bullet"/>
+      <w:lvlText w:val=""/>
+      <w:lvlJc w:val="left"/>
+      <w:pPr>
+        <w:ind w:left="4320" w:hanging="360"/>
+      </w:pPr>
+      <w:rPr>
+        <w:rFonts w:ascii="Wingdings" w:hAnsi="Wingdings" w:hint="default"/>
+      </w:rPr>
+    </w:lvl>
+    <w:lvl w:ilvl="6" w:tplc="08090001" w:tentative="1">
+      <w:start w:val="1"/>
+      <w:numFmt w:val="bullet"/>
+      <w:lvlText w:val=""/>
+      <w:lvlJc w:val="left"/>
+      <w:pPr>
+        <w:ind w:left="5040" w:hanging="360"/>
+      </w:pPr>
+      <w:rPr>
+        <w:rFonts w:ascii="Symbol" w:hAnsi="Symbol" w:hint="default"/>
+      </w:rPr>
+    </w:lvl>
+    <w:lvl w:ilvl="7" w:tplc="08090003" w:tentative="1">
+      <w:start w:val="1"/>
+      <w:numFmt w:val="bullet"/>
+      <w:lvlText w:val="o"/>
+      <w:lvlJc w:val="left"/>
+      <w:pPr>
+        <w:ind w:left="5760" w:hanging="360"/>
+      </w:pPr>
+      <w:rPr>
+        <w:rFonts w:ascii="Courier New" w:hAnsi="Courier New" w:cs="Courier New" w:hint="default"/>
+      </w:rPr>
+    </w:lvl>
+    <w:lvl w:ilvl="8" w:tplc="08090005" w:tentative="1">
+      <w:start w:val="1"/>
+      <w:numFmt w:val="bullet"/>
+      <w:lvlText w:val=""/>
+      <w:lvlJc w:val="left"/>
+      <w:pPr>
+        <w:ind w:left="6480" w:hanging="360"/>
+      </w:pPr>
+      <w:rPr>
+        <w:rFonts w:ascii="Wingdings" w:hAnsi="Wingdings" w:hint="default"/>
+      </w:rPr>
+    </w:lvl>
+  </w:abstractNum>
+  <w:abstractNum w:abstractNumId="1" w15:restartNumberingAfterBreak="0">
     <w:nsid w:val="0987356C"/>
     <w:multiLevelType w:val="hybridMultilevel"/>
     <w:tmpl w:val="490E0F28"/>
@@ -1645,7 +2217,455 @@
       </w:rPr>
     </w:lvl>
   </w:abstractNum>
-  <w:abstractNum w:abstractNumId="1" w15:restartNumberingAfterBreak="0">
+  <w:abstractNum w:abstractNumId="2" w15:restartNumberingAfterBreak="0">
+    <w:nsid w:val="0B4E6DE0"/>
+    <w:multiLevelType w:val="hybridMultilevel"/>
+    <w:tmpl w:val="035C620C"/>
+    <w:lvl w:ilvl="0" w:tplc="D1EE1542">
+      <w:numFmt w:val="bullet"/>
+      <w:lvlText w:val="•"/>
+      <w:lvlJc w:val="left"/>
+      <w:pPr>
+        <w:ind w:left="720" w:hanging="360"/>
+      </w:pPr>
+      <w:rPr>
+        <w:rFonts w:ascii="Times New Roman" w:eastAsiaTheme="minorHAnsi" w:hAnsi="Times New Roman" w:cs="Times New Roman" w:hint="default"/>
+      </w:rPr>
+    </w:lvl>
+    <w:lvl w:ilvl="1" w:tplc="08090003" w:tentative="1">
+      <w:start w:val="1"/>
+      <w:numFmt w:val="bullet"/>
+      <w:lvlText w:val="o"/>
+      <w:lvlJc w:val="left"/>
+      <w:pPr>
+        <w:ind w:left="1440" w:hanging="360"/>
+      </w:pPr>
+      <w:rPr>
+        <w:rFonts w:ascii="Courier New" w:hAnsi="Courier New" w:cs="Courier New" w:hint="default"/>
+      </w:rPr>
+    </w:lvl>
+    <w:lvl w:ilvl="2" w:tplc="08090005" w:tentative="1">
+      <w:start w:val="1"/>
+      <w:numFmt w:val="bullet"/>
+      <w:lvlText w:val=""/>
+      <w:lvlJc w:val="left"/>
+      <w:pPr>
+        <w:ind w:left="2160" w:hanging="360"/>
+      </w:pPr>
+      <w:rPr>
+        <w:rFonts w:ascii="Wingdings" w:hAnsi="Wingdings" w:hint="default"/>
+      </w:rPr>
+    </w:lvl>
+    <w:lvl w:ilvl="3" w:tplc="08090001" w:tentative="1">
+      <w:start w:val="1"/>
+      <w:numFmt w:val="bullet"/>
+      <w:lvlText w:val=""/>
+      <w:lvlJc w:val="left"/>
+      <w:pPr>
+        <w:ind w:left="2880" w:hanging="360"/>
+      </w:pPr>
+      <w:rPr>
+        <w:rFonts w:ascii="Symbol" w:hAnsi="Symbol" w:hint="default"/>
+      </w:rPr>
+    </w:lvl>
+    <w:lvl w:ilvl="4" w:tplc="08090003" w:tentative="1">
+      <w:start w:val="1"/>
+      <w:numFmt w:val="bullet"/>
+      <w:lvlText w:val="o"/>
+      <w:lvlJc w:val="left"/>
+      <w:pPr>
+        <w:ind w:left="3600" w:hanging="360"/>
+      </w:pPr>
+      <w:rPr>
+        <w:rFonts w:ascii="Courier New" w:hAnsi="Courier New" w:cs="Courier New" w:hint="default"/>
+      </w:rPr>
+    </w:lvl>
+    <w:lvl w:ilvl="5" w:tplc="08090005" w:tentative="1">
+      <w:start w:val="1"/>
+      <w:numFmt w:val="bullet"/>
+      <w:lvlText w:val=""/>
+      <w:lvlJc w:val="left"/>
+      <w:pPr>
+        <w:ind w:left="4320" w:hanging="360"/>
+      </w:pPr>
+      <w:rPr>
+        <w:rFonts w:ascii="Wingdings" w:hAnsi="Wingdings" w:hint="default"/>
+      </w:rPr>
+    </w:lvl>
+    <w:lvl w:ilvl="6" w:tplc="08090001" w:tentative="1">
+      <w:start w:val="1"/>
+      <w:numFmt w:val="bullet"/>
+      <w:lvlText w:val=""/>
+      <w:lvlJc w:val="left"/>
+      <w:pPr>
+        <w:ind w:left="5040" w:hanging="360"/>
+      </w:pPr>
+      <w:rPr>
+        <w:rFonts w:ascii="Symbol" w:hAnsi="Symbol" w:hint="default"/>
+      </w:rPr>
+    </w:lvl>
+    <w:lvl w:ilvl="7" w:tplc="08090003" w:tentative="1">
+      <w:start w:val="1"/>
+      <w:numFmt w:val="bullet"/>
+      <w:lvlText w:val="o"/>
+      <w:lvlJc w:val="left"/>
+      <w:pPr>
+        <w:ind w:left="5760" w:hanging="360"/>
+      </w:pPr>
+      <w:rPr>
+        <w:rFonts w:ascii="Courier New" w:hAnsi="Courier New" w:cs="Courier New" w:hint="default"/>
+      </w:rPr>
+    </w:lvl>
+    <w:lvl w:ilvl="8" w:tplc="08090005" w:tentative="1">
+      <w:start w:val="1"/>
+      <w:numFmt w:val="bullet"/>
+      <w:lvlText w:val=""/>
+      <w:lvlJc w:val="left"/>
+      <w:pPr>
+        <w:ind w:left="6480" w:hanging="360"/>
+      </w:pPr>
+      <w:rPr>
+        <w:rFonts w:ascii="Wingdings" w:hAnsi="Wingdings" w:hint="default"/>
+      </w:rPr>
+    </w:lvl>
+  </w:abstractNum>
+  <w:abstractNum w:abstractNumId="3" w15:restartNumberingAfterBreak="0">
+    <w:nsid w:val="13B95AB6"/>
+    <w:multiLevelType w:val="hybridMultilevel"/>
+    <w:tmpl w:val="02C45C0C"/>
+    <w:lvl w:ilvl="0" w:tplc="D1EE1542">
+      <w:numFmt w:val="bullet"/>
+      <w:lvlText w:val="•"/>
+      <w:lvlJc w:val="left"/>
+      <w:pPr>
+        <w:ind w:left="720" w:hanging="360"/>
+      </w:pPr>
+      <w:rPr>
+        <w:rFonts w:ascii="Times New Roman" w:eastAsiaTheme="minorHAnsi" w:hAnsi="Times New Roman" w:cs="Times New Roman" w:hint="default"/>
+      </w:rPr>
+    </w:lvl>
+    <w:lvl w:ilvl="1" w:tplc="08090003" w:tentative="1">
+      <w:start w:val="1"/>
+      <w:numFmt w:val="bullet"/>
+      <w:lvlText w:val="o"/>
+      <w:lvlJc w:val="left"/>
+      <w:pPr>
+        <w:ind w:left="1440" w:hanging="360"/>
+      </w:pPr>
+      <w:rPr>
+        <w:rFonts w:ascii="Courier New" w:hAnsi="Courier New" w:cs="Courier New" w:hint="default"/>
+      </w:rPr>
+    </w:lvl>
+    <w:lvl w:ilvl="2" w:tplc="08090005" w:tentative="1">
+      <w:start w:val="1"/>
+      <w:numFmt w:val="bullet"/>
+      <w:lvlText w:val=""/>
+      <w:lvlJc w:val="left"/>
+      <w:pPr>
+        <w:ind w:left="2160" w:hanging="360"/>
+      </w:pPr>
+      <w:rPr>
+        <w:rFonts w:ascii="Wingdings" w:hAnsi="Wingdings" w:hint="default"/>
+      </w:rPr>
+    </w:lvl>
+    <w:lvl w:ilvl="3" w:tplc="08090001" w:tentative="1">
+      <w:start w:val="1"/>
+      <w:numFmt w:val="bullet"/>
+      <w:lvlText w:val=""/>
+      <w:lvlJc w:val="left"/>
+      <w:pPr>
+        <w:ind w:left="2880" w:hanging="360"/>
+      </w:pPr>
+      <w:rPr>
+        <w:rFonts w:ascii="Symbol" w:hAnsi="Symbol" w:hint="default"/>
+      </w:rPr>
+    </w:lvl>
+    <w:lvl w:ilvl="4" w:tplc="08090003" w:tentative="1">
+      <w:start w:val="1"/>
+      <w:numFmt w:val="bullet"/>
+      <w:lvlText w:val="o"/>
+      <w:lvlJc w:val="left"/>
+      <w:pPr>
+        <w:ind w:left="3600" w:hanging="360"/>
+      </w:pPr>
+      <w:rPr>
+        <w:rFonts w:ascii="Courier New" w:hAnsi="Courier New" w:cs="Courier New" w:hint="default"/>
+      </w:rPr>
+    </w:lvl>
+    <w:lvl w:ilvl="5" w:tplc="08090005" w:tentative="1">
+      <w:start w:val="1"/>
+      <w:numFmt w:val="bullet"/>
+      <w:lvlText w:val=""/>
+      <w:lvlJc w:val="left"/>
+      <w:pPr>
+        <w:ind w:left="4320" w:hanging="360"/>
+      </w:pPr>
+      <w:rPr>
+        <w:rFonts w:ascii="Wingdings" w:hAnsi="Wingdings" w:hint="default"/>
+      </w:rPr>
+    </w:lvl>
+    <w:lvl w:ilvl="6" w:tplc="08090001" w:tentative="1">
+      <w:start w:val="1"/>
+      <w:numFmt w:val="bullet"/>
+      <w:lvlText w:val=""/>
+      <w:lvlJc w:val="left"/>
+      <w:pPr>
+        <w:ind w:left="5040" w:hanging="360"/>
+      </w:pPr>
+      <w:rPr>
+        <w:rFonts w:ascii="Symbol" w:hAnsi="Symbol" w:hint="default"/>
+      </w:rPr>
+    </w:lvl>
+    <w:lvl w:ilvl="7" w:tplc="08090003" w:tentative="1">
+      <w:start w:val="1"/>
+      <w:numFmt w:val="bullet"/>
+      <w:lvlText w:val="o"/>
+      <w:lvlJc w:val="left"/>
+      <w:pPr>
+        <w:ind w:left="5760" w:hanging="360"/>
+      </w:pPr>
+      <w:rPr>
+        <w:rFonts w:ascii="Courier New" w:hAnsi="Courier New" w:cs="Courier New" w:hint="default"/>
+      </w:rPr>
+    </w:lvl>
+    <w:lvl w:ilvl="8" w:tplc="08090005" w:tentative="1">
+      <w:start w:val="1"/>
+      <w:numFmt w:val="bullet"/>
+      <w:lvlText w:val=""/>
+      <w:lvlJc w:val="left"/>
+      <w:pPr>
+        <w:ind w:left="6480" w:hanging="360"/>
+      </w:pPr>
+      <w:rPr>
+        <w:rFonts w:ascii="Wingdings" w:hAnsi="Wingdings" w:hint="default"/>
+      </w:rPr>
+    </w:lvl>
+  </w:abstractNum>
+  <w:abstractNum w:abstractNumId="4" w15:restartNumberingAfterBreak="0">
+    <w:nsid w:val="14775702"/>
+    <w:multiLevelType w:val="hybridMultilevel"/>
+    <w:tmpl w:val="033EC564"/>
+    <w:lvl w:ilvl="0" w:tplc="D1EE1542">
+      <w:numFmt w:val="bullet"/>
+      <w:lvlText w:val="•"/>
+      <w:lvlJc w:val="left"/>
+      <w:pPr>
+        <w:ind w:left="720" w:hanging="360"/>
+      </w:pPr>
+      <w:rPr>
+        <w:rFonts w:ascii="Times New Roman" w:eastAsiaTheme="minorHAnsi" w:hAnsi="Times New Roman" w:cs="Times New Roman" w:hint="default"/>
+      </w:rPr>
+    </w:lvl>
+    <w:lvl w:ilvl="1" w:tplc="08090003" w:tentative="1">
+      <w:start w:val="1"/>
+      <w:numFmt w:val="bullet"/>
+      <w:lvlText w:val="o"/>
+      <w:lvlJc w:val="left"/>
+      <w:pPr>
+        <w:ind w:left="1440" w:hanging="360"/>
+      </w:pPr>
+      <w:rPr>
+        <w:rFonts w:ascii="Courier New" w:hAnsi="Courier New" w:cs="Courier New" w:hint="default"/>
+      </w:rPr>
+    </w:lvl>
+    <w:lvl w:ilvl="2" w:tplc="08090005" w:tentative="1">
+      <w:start w:val="1"/>
+      <w:numFmt w:val="bullet"/>
+      <w:lvlText w:val=""/>
+      <w:lvlJc w:val="left"/>
+      <w:pPr>
+        <w:ind w:left="2160" w:hanging="360"/>
+      </w:pPr>
+      <w:rPr>
+        <w:rFonts w:ascii="Wingdings" w:hAnsi="Wingdings" w:hint="default"/>
+      </w:rPr>
+    </w:lvl>
+    <w:lvl w:ilvl="3" w:tplc="08090001" w:tentative="1">
+      <w:start w:val="1"/>
+      <w:numFmt w:val="bullet"/>
+      <w:lvlText w:val=""/>
+      <w:lvlJc w:val="left"/>
+      <w:pPr>
+        <w:ind w:left="2880" w:hanging="360"/>
+      </w:pPr>
+      <w:rPr>
+        <w:rFonts w:ascii="Symbol" w:hAnsi="Symbol" w:hint="default"/>
+      </w:rPr>
+    </w:lvl>
+    <w:lvl w:ilvl="4" w:tplc="08090003" w:tentative="1">
+      <w:start w:val="1"/>
+      <w:numFmt w:val="bullet"/>
+      <w:lvlText w:val="o"/>
+      <w:lvlJc w:val="left"/>
+      <w:pPr>
+        <w:ind w:left="3600" w:hanging="360"/>
+      </w:pPr>
+      <w:rPr>
+        <w:rFonts w:ascii="Courier New" w:hAnsi="Courier New" w:cs="Courier New" w:hint="default"/>
+      </w:rPr>
+    </w:lvl>
+    <w:lvl w:ilvl="5" w:tplc="08090005" w:tentative="1">
+      <w:start w:val="1"/>
+      <w:numFmt w:val="bullet"/>
+      <w:lvlText w:val=""/>
+      <w:lvlJc w:val="left"/>
+      <w:pPr>
+        <w:ind w:left="4320" w:hanging="360"/>
+      </w:pPr>
+      <w:rPr>
+        <w:rFonts w:ascii="Wingdings" w:hAnsi="Wingdings" w:hint="default"/>
+      </w:rPr>
+    </w:lvl>
+    <w:lvl w:ilvl="6" w:tplc="08090001" w:tentative="1">
+      <w:start w:val="1"/>
+      <w:numFmt w:val="bullet"/>
+      <w:lvlText w:val=""/>
+      <w:lvlJc w:val="left"/>
+      <w:pPr>
+        <w:ind w:left="5040" w:hanging="360"/>
+      </w:pPr>
+      <w:rPr>
+        <w:rFonts w:ascii="Symbol" w:hAnsi="Symbol" w:hint="default"/>
+      </w:rPr>
+    </w:lvl>
+    <w:lvl w:ilvl="7" w:tplc="08090003" w:tentative="1">
+      <w:start w:val="1"/>
+      <w:numFmt w:val="bullet"/>
+      <w:lvlText w:val="o"/>
+      <w:lvlJc w:val="left"/>
+      <w:pPr>
+        <w:ind w:left="5760" w:hanging="360"/>
+      </w:pPr>
+      <w:rPr>
+        <w:rFonts w:ascii="Courier New" w:hAnsi="Courier New" w:cs="Courier New" w:hint="default"/>
+      </w:rPr>
+    </w:lvl>
+    <w:lvl w:ilvl="8" w:tplc="08090005" w:tentative="1">
+      <w:start w:val="1"/>
+      <w:numFmt w:val="bullet"/>
+      <w:lvlText w:val=""/>
+      <w:lvlJc w:val="left"/>
+      <w:pPr>
+        <w:ind w:left="6480" w:hanging="360"/>
+      </w:pPr>
+      <w:rPr>
+        <w:rFonts w:ascii="Wingdings" w:hAnsi="Wingdings" w:hint="default"/>
+      </w:rPr>
+    </w:lvl>
+  </w:abstractNum>
+  <w:abstractNum w:abstractNumId="5" w15:restartNumberingAfterBreak="0">
+    <w:nsid w:val="208A0FCB"/>
+    <w:multiLevelType w:val="hybridMultilevel"/>
+    <w:tmpl w:val="32766246"/>
+    <w:lvl w:ilvl="0" w:tplc="D1EE1542">
+      <w:numFmt w:val="bullet"/>
+      <w:lvlText w:val="•"/>
+      <w:lvlJc w:val="left"/>
+      <w:pPr>
+        <w:ind w:left="1080" w:hanging="360"/>
+      </w:pPr>
+      <w:rPr>
+        <w:rFonts w:ascii="Times New Roman" w:eastAsiaTheme="minorHAnsi" w:hAnsi="Times New Roman" w:cs="Times New Roman" w:hint="default"/>
+      </w:rPr>
+    </w:lvl>
+    <w:lvl w:ilvl="1" w:tplc="08090003" w:tentative="1">
+      <w:start w:val="1"/>
+      <w:numFmt w:val="bullet"/>
+      <w:lvlText w:val="o"/>
+      <w:lvlJc w:val="left"/>
+      <w:pPr>
+        <w:ind w:left="1800" w:hanging="360"/>
+      </w:pPr>
+      <w:rPr>
+        <w:rFonts w:ascii="Courier New" w:hAnsi="Courier New" w:cs="Courier New" w:hint="default"/>
+      </w:rPr>
+    </w:lvl>
+    <w:lvl w:ilvl="2" w:tplc="08090005" w:tentative="1">
+      <w:start w:val="1"/>
+      <w:numFmt w:val="bullet"/>
+      <w:lvlText w:val=""/>
+      <w:lvlJc w:val="left"/>
+      <w:pPr>
+        <w:ind w:left="2520" w:hanging="360"/>
+      </w:pPr>
+      <w:rPr>
+        <w:rFonts w:ascii="Wingdings" w:hAnsi="Wingdings" w:hint="default"/>
+      </w:rPr>
+    </w:lvl>
+    <w:lvl w:ilvl="3" w:tplc="08090001" w:tentative="1">
+      <w:start w:val="1"/>
+      <w:numFmt w:val="bullet"/>
+      <w:lvlText w:val=""/>
+      <w:lvlJc w:val="left"/>
+      <w:pPr>
+        <w:ind w:left="3240" w:hanging="360"/>
+      </w:pPr>
+      <w:rPr>
+        <w:rFonts w:ascii="Symbol" w:hAnsi="Symbol" w:hint="default"/>
+      </w:rPr>
+    </w:lvl>
+    <w:lvl w:ilvl="4" w:tplc="08090003" w:tentative="1">
+      <w:start w:val="1"/>
+      <w:numFmt w:val="bullet"/>
+      <w:lvlText w:val="o"/>
+      <w:lvlJc w:val="left"/>
+      <w:pPr>
+        <w:ind w:left="3960" w:hanging="360"/>
+      </w:pPr>
+      <w:rPr>
+        <w:rFonts w:ascii="Courier New" w:hAnsi="Courier New" w:cs="Courier New" w:hint="default"/>
+      </w:rPr>
+    </w:lvl>
+    <w:lvl w:ilvl="5" w:tplc="08090005" w:tentative="1">
+      <w:start w:val="1"/>
+      <w:numFmt w:val="bullet"/>
+      <w:lvlText w:val=""/>
+      <w:lvlJc w:val="left"/>
+      <w:pPr>
+        <w:ind w:left="4680" w:hanging="360"/>
+      </w:pPr>
+      <w:rPr>
+        <w:rFonts w:ascii="Wingdings" w:hAnsi="Wingdings" w:hint="default"/>
+      </w:rPr>
+    </w:lvl>
+    <w:lvl w:ilvl="6" w:tplc="08090001" w:tentative="1">
+      <w:start w:val="1"/>
+      <w:numFmt w:val="bullet"/>
+      <w:lvlText w:val=""/>
+      <w:lvlJc w:val="left"/>
+      <w:pPr>
+        <w:ind w:left="5400" w:hanging="360"/>
+      </w:pPr>
+      <w:rPr>
+        <w:rFonts w:ascii="Symbol" w:hAnsi="Symbol" w:hint="default"/>
+      </w:rPr>
+    </w:lvl>
+    <w:lvl w:ilvl="7" w:tplc="08090003" w:tentative="1">
+      <w:start w:val="1"/>
+      <w:numFmt w:val="bullet"/>
+      <w:lvlText w:val="o"/>
+      <w:lvlJc w:val="left"/>
+      <w:pPr>
+        <w:ind w:left="6120" w:hanging="360"/>
+      </w:pPr>
+      <w:rPr>
+        <w:rFonts w:ascii="Courier New" w:hAnsi="Courier New" w:cs="Courier New" w:hint="default"/>
+      </w:rPr>
+    </w:lvl>
+    <w:lvl w:ilvl="8" w:tplc="08090005" w:tentative="1">
+      <w:start w:val="1"/>
+      <w:numFmt w:val="bullet"/>
+      <w:lvlText w:val=""/>
+      <w:lvlJc w:val="left"/>
+      <w:pPr>
+        <w:ind w:left="6840" w:hanging="360"/>
+      </w:pPr>
+      <w:rPr>
+        <w:rFonts w:ascii="Wingdings" w:hAnsi="Wingdings" w:hint="default"/>
+      </w:rPr>
+    </w:lvl>
+  </w:abstractNum>
+  <w:abstractNum w:abstractNumId="6" w15:restartNumberingAfterBreak="0">
     <w:nsid w:val="286143A4"/>
     <w:multiLevelType w:val="multilevel"/>
     <w:tmpl w:val="08090025"/>
@@ -1740,7 +2760,7 @@
       </w:pPr>
     </w:lvl>
   </w:abstractNum>
-  <w:abstractNum w:abstractNumId="2" w15:restartNumberingAfterBreak="0">
+  <w:abstractNum w:abstractNumId="7" w15:restartNumberingAfterBreak="0">
     <w:nsid w:val="30E03C8C"/>
     <w:multiLevelType w:val="hybridMultilevel"/>
     <w:tmpl w:val="463CDEF4"/>
@@ -1852,7 +2872,343 @@
       </w:rPr>
     </w:lvl>
   </w:abstractNum>
-  <w:abstractNum w:abstractNumId="3" w15:restartNumberingAfterBreak="0">
+  <w:abstractNum w:abstractNumId="8" w15:restartNumberingAfterBreak="0">
+    <w:nsid w:val="32F10D10"/>
+    <w:multiLevelType w:val="hybridMultilevel"/>
+    <w:tmpl w:val="BC1E50CE"/>
+    <w:lvl w:ilvl="0" w:tplc="D1EE1542">
+      <w:numFmt w:val="bullet"/>
+      <w:lvlText w:val="•"/>
+      <w:lvlJc w:val="left"/>
+      <w:pPr>
+        <w:ind w:left="1080" w:hanging="360"/>
+      </w:pPr>
+      <w:rPr>
+        <w:rFonts w:ascii="Times New Roman" w:eastAsiaTheme="minorHAnsi" w:hAnsi="Times New Roman" w:cs="Times New Roman" w:hint="default"/>
+      </w:rPr>
+    </w:lvl>
+    <w:lvl w:ilvl="1" w:tplc="08090003" w:tentative="1">
+      <w:start w:val="1"/>
+      <w:numFmt w:val="bullet"/>
+      <w:lvlText w:val="o"/>
+      <w:lvlJc w:val="left"/>
+      <w:pPr>
+        <w:ind w:left="1800" w:hanging="360"/>
+      </w:pPr>
+      <w:rPr>
+        <w:rFonts w:ascii="Courier New" w:hAnsi="Courier New" w:cs="Courier New" w:hint="default"/>
+      </w:rPr>
+    </w:lvl>
+    <w:lvl w:ilvl="2" w:tplc="08090005" w:tentative="1">
+      <w:start w:val="1"/>
+      <w:numFmt w:val="bullet"/>
+      <w:lvlText w:val=""/>
+      <w:lvlJc w:val="left"/>
+      <w:pPr>
+        <w:ind w:left="2520" w:hanging="360"/>
+      </w:pPr>
+      <w:rPr>
+        <w:rFonts w:ascii="Wingdings" w:hAnsi="Wingdings" w:hint="default"/>
+      </w:rPr>
+    </w:lvl>
+    <w:lvl w:ilvl="3" w:tplc="08090001" w:tentative="1">
+      <w:start w:val="1"/>
+      <w:numFmt w:val="bullet"/>
+      <w:lvlText w:val=""/>
+      <w:lvlJc w:val="left"/>
+      <w:pPr>
+        <w:ind w:left="3240" w:hanging="360"/>
+      </w:pPr>
+      <w:rPr>
+        <w:rFonts w:ascii="Symbol" w:hAnsi="Symbol" w:hint="default"/>
+      </w:rPr>
+    </w:lvl>
+    <w:lvl w:ilvl="4" w:tplc="08090003" w:tentative="1">
+      <w:start w:val="1"/>
+      <w:numFmt w:val="bullet"/>
+      <w:lvlText w:val="o"/>
+      <w:lvlJc w:val="left"/>
+      <w:pPr>
+        <w:ind w:left="3960" w:hanging="360"/>
+      </w:pPr>
+      <w:rPr>
+        <w:rFonts w:ascii="Courier New" w:hAnsi="Courier New" w:cs="Courier New" w:hint="default"/>
+      </w:rPr>
+    </w:lvl>
+    <w:lvl w:ilvl="5" w:tplc="08090005" w:tentative="1">
+      <w:start w:val="1"/>
+      <w:numFmt w:val="bullet"/>
+      <w:lvlText w:val=""/>
+      <w:lvlJc w:val="left"/>
+      <w:pPr>
+        <w:ind w:left="4680" w:hanging="360"/>
+      </w:pPr>
+      <w:rPr>
+        <w:rFonts w:ascii="Wingdings" w:hAnsi="Wingdings" w:hint="default"/>
+      </w:rPr>
+    </w:lvl>
+    <w:lvl w:ilvl="6" w:tplc="08090001" w:tentative="1">
+      <w:start w:val="1"/>
+      <w:numFmt w:val="bullet"/>
+      <w:lvlText w:val=""/>
+      <w:lvlJc w:val="left"/>
+      <w:pPr>
+        <w:ind w:left="5400" w:hanging="360"/>
+      </w:pPr>
+      <w:rPr>
+        <w:rFonts w:ascii="Symbol" w:hAnsi="Symbol" w:hint="default"/>
+      </w:rPr>
+    </w:lvl>
+    <w:lvl w:ilvl="7" w:tplc="08090003" w:tentative="1">
+      <w:start w:val="1"/>
+      <w:numFmt w:val="bullet"/>
+      <w:lvlText w:val="o"/>
+      <w:lvlJc w:val="left"/>
+      <w:pPr>
+        <w:ind w:left="6120" w:hanging="360"/>
+      </w:pPr>
+      <w:rPr>
+        <w:rFonts w:ascii="Courier New" w:hAnsi="Courier New" w:cs="Courier New" w:hint="default"/>
+      </w:rPr>
+    </w:lvl>
+    <w:lvl w:ilvl="8" w:tplc="08090005" w:tentative="1">
+      <w:start w:val="1"/>
+      <w:numFmt w:val="bullet"/>
+      <w:lvlText w:val=""/>
+      <w:lvlJc w:val="left"/>
+      <w:pPr>
+        <w:ind w:left="6840" w:hanging="360"/>
+      </w:pPr>
+      <w:rPr>
+        <w:rFonts w:ascii="Wingdings" w:hAnsi="Wingdings" w:hint="default"/>
+      </w:rPr>
+    </w:lvl>
+  </w:abstractNum>
+  <w:abstractNum w:abstractNumId="9" w15:restartNumberingAfterBreak="0">
+    <w:nsid w:val="3C170177"/>
+    <w:multiLevelType w:val="hybridMultilevel"/>
+    <w:tmpl w:val="BB460F78"/>
+    <w:lvl w:ilvl="0" w:tplc="D1EE1542">
+      <w:numFmt w:val="bullet"/>
+      <w:lvlText w:val="•"/>
+      <w:lvlJc w:val="left"/>
+      <w:pPr>
+        <w:ind w:left="1080" w:hanging="360"/>
+      </w:pPr>
+      <w:rPr>
+        <w:rFonts w:ascii="Times New Roman" w:eastAsiaTheme="minorHAnsi" w:hAnsi="Times New Roman" w:cs="Times New Roman" w:hint="default"/>
+      </w:rPr>
+    </w:lvl>
+    <w:lvl w:ilvl="1" w:tplc="08090003" w:tentative="1">
+      <w:start w:val="1"/>
+      <w:numFmt w:val="bullet"/>
+      <w:lvlText w:val="o"/>
+      <w:lvlJc w:val="left"/>
+      <w:pPr>
+        <w:ind w:left="1800" w:hanging="360"/>
+      </w:pPr>
+      <w:rPr>
+        <w:rFonts w:ascii="Courier New" w:hAnsi="Courier New" w:cs="Courier New" w:hint="default"/>
+      </w:rPr>
+    </w:lvl>
+    <w:lvl w:ilvl="2" w:tplc="08090005" w:tentative="1">
+      <w:start w:val="1"/>
+      <w:numFmt w:val="bullet"/>
+      <w:lvlText w:val=""/>
+      <w:lvlJc w:val="left"/>
+      <w:pPr>
+        <w:ind w:left="2520" w:hanging="360"/>
+      </w:pPr>
+      <w:rPr>
+        <w:rFonts w:ascii="Wingdings" w:hAnsi="Wingdings" w:hint="default"/>
+      </w:rPr>
+    </w:lvl>
+    <w:lvl w:ilvl="3" w:tplc="08090001" w:tentative="1">
+      <w:start w:val="1"/>
+      <w:numFmt w:val="bullet"/>
+      <w:lvlText w:val=""/>
+      <w:lvlJc w:val="left"/>
+      <w:pPr>
+        <w:ind w:left="3240" w:hanging="360"/>
+      </w:pPr>
+      <w:rPr>
+        <w:rFonts w:ascii="Symbol" w:hAnsi="Symbol" w:hint="default"/>
+      </w:rPr>
+    </w:lvl>
+    <w:lvl w:ilvl="4" w:tplc="08090003" w:tentative="1">
+      <w:start w:val="1"/>
+      <w:numFmt w:val="bullet"/>
+      <w:lvlText w:val="o"/>
+      <w:lvlJc w:val="left"/>
+      <w:pPr>
+        <w:ind w:left="3960" w:hanging="360"/>
+      </w:pPr>
+      <w:rPr>
+        <w:rFonts w:ascii="Courier New" w:hAnsi="Courier New" w:cs="Courier New" w:hint="default"/>
+      </w:rPr>
+    </w:lvl>
+    <w:lvl w:ilvl="5" w:tplc="08090005" w:tentative="1">
+      <w:start w:val="1"/>
+      <w:numFmt w:val="bullet"/>
+      <w:lvlText w:val=""/>
+      <w:lvlJc w:val="left"/>
+      <w:pPr>
+        <w:ind w:left="4680" w:hanging="360"/>
+      </w:pPr>
+      <w:rPr>
+        <w:rFonts w:ascii="Wingdings" w:hAnsi="Wingdings" w:hint="default"/>
+      </w:rPr>
+    </w:lvl>
+    <w:lvl w:ilvl="6" w:tplc="08090001" w:tentative="1">
+      <w:start w:val="1"/>
+      <w:numFmt w:val="bullet"/>
+      <w:lvlText w:val=""/>
+      <w:lvlJc w:val="left"/>
+      <w:pPr>
+        <w:ind w:left="5400" w:hanging="360"/>
+      </w:pPr>
+      <w:rPr>
+        <w:rFonts w:ascii="Symbol" w:hAnsi="Symbol" w:hint="default"/>
+      </w:rPr>
+    </w:lvl>
+    <w:lvl w:ilvl="7" w:tplc="08090003" w:tentative="1">
+      <w:start w:val="1"/>
+      <w:numFmt w:val="bullet"/>
+      <w:lvlText w:val="o"/>
+      <w:lvlJc w:val="left"/>
+      <w:pPr>
+        <w:ind w:left="6120" w:hanging="360"/>
+      </w:pPr>
+      <w:rPr>
+        <w:rFonts w:ascii="Courier New" w:hAnsi="Courier New" w:cs="Courier New" w:hint="default"/>
+      </w:rPr>
+    </w:lvl>
+    <w:lvl w:ilvl="8" w:tplc="08090005" w:tentative="1">
+      <w:start w:val="1"/>
+      <w:numFmt w:val="bullet"/>
+      <w:lvlText w:val=""/>
+      <w:lvlJc w:val="left"/>
+      <w:pPr>
+        <w:ind w:left="6840" w:hanging="360"/>
+      </w:pPr>
+      <w:rPr>
+        <w:rFonts w:ascii="Wingdings" w:hAnsi="Wingdings" w:hint="default"/>
+      </w:rPr>
+    </w:lvl>
+  </w:abstractNum>
+  <w:abstractNum w:abstractNumId="10" w15:restartNumberingAfterBreak="0">
+    <w:nsid w:val="406E01FF"/>
+    <w:multiLevelType w:val="hybridMultilevel"/>
+    <w:tmpl w:val="AB14A208"/>
+    <w:lvl w:ilvl="0" w:tplc="D1EE1542">
+      <w:numFmt w:val="bullet"/>
+      <w:lvlText w:val="•"/>
+      <w:lvlJc w:val="left"/>
+      <w:pPr>
+        <w:ind w:left="1080" w:hanging="360"/>
+      </w:pPr>
+      <w:rPr>
+        <w:rFonts w:ascii="Times New Roman" w:eastAsiaTheme="minorHAnsi" w:hAnsi="Times New Roman" w:cs="Times New Roman" w:hint="default"/>
+      </w:rPr>
+    </w:lvl>
+    <w:lvl w:ilvl="1" w:tplc="08090003" w:tentative="1">
+      <w:start w:val="1"/>
+      <w:numFmt w:val="bullet"/>
+      <w:lvlText w:val="o"/>
+      <w:lvlJc w:val="left"/>
+      <w:pPr>
+        <w:ind w:left="1800" w:hanging="360"/>
+      </w:pPr>
+      <w:rPr>
+        <w:rFonts w:ascii="Courier New" w:hAnsi="Courier New" w:cs="Courier New" w:hint="default"/>
+      </w:rPr>
+    </w:lvl>
+    <w:lvl w:ilvl="2" w:tplc="08090005" w:tentative="1">
+      <w:start w:val="1"/>
+      <w:numFmt w:val="bullet"/>
+      <w:lvlText w:val=""/>
+      <w:lvlJc w:val="left"/>
+      <w:pPr>
+        <w:ind w:left="2520" w:hanging="360"/>
+      </w:pPr>
+      <w:rPr>
+        <w:rFonts w:ascii="Wingdings" w:hAnsi="Wingdings" w:hint="default"/>
+      </w:rPr>
+    </w:lvl>
+    <w:lvl w:ilvl="3" w:tplc="08090001" w:tentative="1">
+      <w:start w:val="1"/>
+      <w:numFmt w:val="bullet"/>
+      <w:lvlText w:val=""/>
+      <w:lvlJc w:val="left"/>
+      <w:pPr>
+        <w:ind w:left="3240" w:hanging="360"/>
+      </w:pPr>
+      <w:rPr>
+        <w:rFonts w:ascii="Symbol" w:hAnsi="Symbol" w:hint="default"/>
+      </w:rPr>
+    </w:lvl>
+    <w:lvl w:ilvl="4" w:tplc="08090003" w:tentative="1">
+      <w:start w:val="1"/>
+      <w:numFmt w:val="bullet"/>
+      <w:lvlText w:val="o"/>
+      <w:lvlJc w:val="left"/>
+      <w:pPr>
+        <w:ind w:left="3960" w:hanging="360"/>
+      </w:pPr>
+      <w:rPr>
+        <w:rFonts w:ascii="Courier New" w:hAnsi="Courier New" w:cs="Courier New" w:hint="default"/>
+      </w:rPr>
+    </w:lvl>
+    <w:lvl w:ilvl="5" w:tplc="08090005" w:tentative="1">
+      <w:start w:val="1"/>
+      <w:numFmt w:val="bullet"/>
+      <w:lvlText w:val=""/>
+      <w:lvlJc w:val="left"/>
+      <w:pPr>
+        <w:ind w:left="4680" w:hanging="360"/>
+      </w:pPr>
+      <w:rPr>
+        <w:rFonts w:ascii="Wingdings" w:hAnsi="Wingdings" w:hint="default"/>
+      </w:rPr>
+    </w:lvl>
+    <w:lvl w:ilvl="6" w:tplc="08090001" w:tentative="1">
+      <w:start w:val="1"/>
+      <w:numFmt w:val="bullet"/>
+      <w:lvlText w:val=""/>
+      <w:lvlJc w:val="left"/>
+      <w:pPr>
+        <w:ind w:left="5400" w:hanging="360"/>
+      </w:pPr>
+      <w:rPr>
+        <w:rFonts w:ascii="Symbol" w:hAnsi="Symbol" w:hint="default"/>
+      </w:rPr>
+    </w:lvl>
+    <w:lvl w:ilvl="7" w:tplc="08090003" w:tentative="1">
+      <w:start w:val="1"/>
+      <w:numFmt w:val="bullet"/>
+      <w:lvlText w:val="o"/>
+      <w:lvlJc w:val="left"/>
+      <w:pPr>
+        <w:ind w:left="6120" w:hanging="360"/>
+      </w:pPr>
+      <w:rPr>
+        <w:rFonts w:ascii="Courier New" w:hAnsi="Courier New" w:cs="Courier New" w:hint="default"/>
+      </w:rPr>
+    </w:lvl>
+    <w:lvl w:ilvl="8" w:tplc="08090005" w:tentative="1">
+      <w:start w:val="1"/>
+      <w:numFmt w:val="bullet"/>
+      <w:lvlText w:val=""/>
+      <w:lvlJc w:val="left"/>
+      <w:pPr>
+        <w:ind w:left="6840" w:hanging="360"/>
+      </w:pPr>
+      <w:rPr>
+        <w:rFonts w:ascii="Wingdings" w:hAnsi="Wingdings" w:hint="default"/>
+      </w:rPr>
+    </w:lvl>
+  </w:abstractNum>
+  <w:abstractNum w:abstractNumId="11" w15:restartNumberingAfterBreak="0">
     <w:nsid w:val="506A3ECF"/>
     <w:multiLevelType w:val="hybridMultilevel"/>
     <w:tmpl w:val="8000E48A"/>
@@ -1965,17 +3321,271 @@
       </w:rPr>
     </w:lvl>
   </w:abstractNum>
+  <w:abstractNum w:abstractNumId="12" w15:restartNumberingAfterBreak="0">
+    <w:nsid w:val="62D719DE"/>
+    <w:multiLevelType w:val="hybridMultilevel"/>
+    <w:tmpl w:val="0214078E"/>
+    <w:lvl w:ilvl="0" w:tplc="D1EE1542">
+      <w:numFmt w:val="bullet"/>
+      <w:lvlText w:val="•"/>
+      <w:lvlJc w:val="left"/>
+      <w:pPr>
+        <w:ind w:left="1080" w:hanging="360"/>
+      </w:pPr>
+      <w:rPr>
+        <w:rFonts w:ascii="Times New Roman" w:eastAsiaTheme="minorHAnsi" w:hAnsi="Times New Roman" w:cs="Times New Roman" w:hint="default"/>
+      </w:rPr>
+    </w:lvl>
+    <w:lvl w:ilvl="1" w:tplc="08090003" w:tentative="1">
+      <w:start w:val="1"/>
+      <w:numFmt w:val="bullet"/>
+      <w:lvlText w:val="o"/>
+      <w:lvlJc w:val="left"/>
+      <w:pPr>
+        <w:ind w:left="1800" w:hanging="360"/>
+      </w:pPr>
+      <w:rPr>
+        <w:rFonts w:ascii="Courier New" w:hAnsi="Courier New" w:cs="Courier New" w:hint="default"/>
+      </w:rPr>
+    </w:lvl>
+    <w:lvl w:ilvl="2" w:tplc="08090005" w:tentative="1">
+      <w:start w:val="1"/>
+      <w:numFmt w:val="bullet"/>
+      <w:lvlText w:val=""/>
+      <w:lvlJc w:val="left"/>
+      <w:pPr>
+        <w:ind w:left="2520" w:hanging="360"/>
+      </w:pPr>
+      <w:rPr>
+        <w:rFonts w:ascii="Wingdings" w:hAnsi="Wingdings" w:hint="default"/>
+      </w:rPr>
+    </w:lvl>
+    <w:lvl w:ilvl="3" w:tplc="08090001" w:tentative="1">
+      <w:start w:val="1"/>
+      <w:numFmt w:val="bullet"/>
+      <w:lvlText w:val=""/>
+      <w:lvlJc w:val="left"/>
+      <w:pPr>
+        <w:ind w:left="3240" w:hanging="360"/>
+      </w:pPr>
+      <w:rPr>
+        <w:rFonts w:ascii="Symbol" w:hAnsi="Symbol" w:hint="default"/>
+      </w:rPr>
+    </w:lvl>
+    <w:lvl w:ilvl="4" w:tplc="08090003" w:tentative="1">
+      <w:start w:val="1"/>
+      <w:numFmt w:val="bullet"/>
+      <w:lvlText w:val="o"/>
+      <w:lvlJc w:val="left"/>
+      <w:pPr>
+        <w:ind w:left="3960" w:hanging="360"/>
+      </w:pPr>
+      <w:rPr>
+        <w:rFonts w:ascii="Courier New" w:hAnsi="Courier New" w:cs="Courier New" w:hint="default"/>
+      </w:rPr>
+    </w:lvl>
+    <w:lvl w:ilvl="5" w:tplc="08090005" w:tentative="1">
+      <w:start w:val="1"/>
+      <w:numFmt w:val="bullet"/>
+      <w:lvlText w:val=""/>
+      <w:lvlJc w:val="left"/>
+      <w:pPr>
+        <w:ind w:left="4680" w:hanging="360"/>
+      </w:pPr>
+      <w:rPr>
+        <w:rFonts w:ascii="Wingdings" w:hAnsi="Wingdings" w:hint="default"/>
+      </w:rPr>
+    </w:lvl>
+    <w:lvl w:ilvl="6" w:tplc="08090001" w:tentative="1">
+      <w:start w:val="1"/>
+      <w:numFmt w:val="bullet"/>
+      <w:lvlText w:val=""/>
+      <w:lvlJc w:val="left"/>
+      <w:pPr>
+        <w:ind w:left="5400" w:hanging="360"/>
+      </w:pPr>
+      <w:rPr>
+        <w:rFonts w:ascii="Symbol" w:hAnsi="Symbol" w:hint="default"/>
+      </w:rPr>
+    </w:lvl>
+    <w:lvl w:ilvl="7" w:tplc="08090003" w:tentative="1">
+      <w:start w:val="1"/>
+      <w:numFmt w:val="bullet"/>
+      <w:lvlText w:val="o"/>
+      <w:lvlJc w:val="left"/>
+      <w:pPr>
+        <w:ind w:left="6120" w:hanging="360"/>
+      </w:pPr>
+      <w:rPr>
+        <w:rFonts w:ascii="Courier New" w:hAnsi="Courier New" w:cs="Courier New" w:hint="default"/>
+      </w:rPr>
+    </w:lvl>
+    <w:lvl w:ilvl="8" w:tplc="08090005" w:tentative="1">
+      <w:start w:val="1"/>
+      <w:numFmt w:val="bullet"/>
+      <w:lvlText w:val=""/>
+      <w:lvlJc w:val="left"/>
+      <w:pPr>
+        <w:ind w:left="6840" w:hanging="360"/>
+      </w:pPr>
+      <w:rPr>
+        <w:rFonts w:ascii="Wingdings" w:hAnsi="Wingdings" w:hint="default"/>
+      </w:rPr>
+    </w:lvl>
+  </w:abstractNum>
+  <w:abstractNum w:abstractNumId="13" w15:restartNumberingAfterBreak="0">
+    <w:nsid w:val="6E451471"/>
+    <w:multiLevelType w:val="hybridMultilevel"/>
+    <w:tmpl w:val="DE527322"/>
+    <w:lvl w:ilvl="0" w:tplc="D1EE1542">
+      <w:numFmt w:val="bullet"/>
+      <w:lvlText w:val="•"/>
+      <w:lvlJc w:val="left"/>
+      <w:pPr>
+        <w:ind w:left="720" w:hanging="360"/>
+      </w:pPr>
+      <w:rPr>
+        <w:rFonts w:ascii="Times New Roman" w:eastAsiaTheme="minorHAnsi" w:hAnsi="Times New Roman" w:cs="Times New Roman" w:hint="default"/>
+      </w:rPr>
+    </w:lvl>
+    <w:lvl w:ilvl="1" w:tplc="08090003" w:tentative="1">
+      <w:start w:val="1"/>
+      <w:numFmt w:val="bullet"/>
+      <w:lvlText w:val="o"/>
+      <w:lvlJc w:val="left"/>
+      <w:pPr>
+        <w:ind w:left="1440" w:hanging="360"/>
+      </w:pPr>
+      <w:rPr>
+        <w:rFonts w:ascii="Courier New" w:hAnsi="Courier New" w:cs="Courier New" w:hint="default"/>
+      </w:rPr>
+    </w:lvl>
+    <w:lvl w:ilvl="2" w:tplc="08090005" w:tentative="1">
+      <w:start w:val="1"/>
+      <w:numFmt w:val="bullet"/>
+      <w:lvlText w:val=""/>
+      <w:lvlJc w:val="left"/>
+      <w:pPr>
+        <w:ind w:left="2160" w:hanging="360"/>
+      </w:pPr>
+      <w:rPr>
+        <w:rFonts w:ascii="Wingdings" w:hAnsi="Wingdings" w:hint="default"/>
+      </w:rPr>
+    </w:lvl>
+    <w:lvl w:ilvl="3" w:tplc="08090001" w:tentative="1">
+      <w:start w:val="1"/>
+      <w:numFmt w:val="bullet"/>
+      <w:lvlText w:val=""/>
+      <w:lvlJc w:val="left"/>
+      <w:pPr>
+        <w:ind w:left="2880" w:hanging="360"/>
+      </w:pPr>
+      <w:rPr>
+        <w:rFonts w:ascii="Symbol" w:hAnsi="Symbol" w:hint="default"/>
+      </w:rPr>
+    </w:lvl>
+    <w:lvl w:ilvl="4" w:tplc="08090003" w:tentative="1">
+      <w:start w:val="1"/>
+      <w:numFmt w:val="bullet"/>
+      <w:lvlText w:val="o"/>
+      <w:lvlJc w:val="left"/>
+      <w:pPr>
+        <w:ind w:left="3600" w:hanging="360"/>
+      </w:pPr>
+      <w:rPr>
+        <w:rFonts w:ascii="Courier New" w:hAnsi="Courier New" w:cs="Courier New" w:hint="default"/>
+      </w:rPr>
+    </w:lvl>
+    <w:lvl w:ilvl="5" w:tplc="08090005" w:tentative="1">
+      <w:start w:val="1"/>
+      <w:numFmt w:val="bullet"/>
+      <w:lvlText w:val=""/>
+      <w:lvlJc w:val="left"/>
+      <w:pPr>
+        <w:ind w:left="4320" w:hanging="360"/>
+      </w:pPr>
+      <w:rPr>
+        <w:rFonts w:ascii="Wingdings" w:hAnsi="Wingdings" w:hint="default"/>
+      </w:rPr>
+    </w:lvl>
+    <w:lvl w:ilvl="6" w:tplc="08090001" w:tentative="1">
+      <w:start w:val="1"/>
+      <w:numFmt w:val="bullet"/>
+      <w:lvlText w:val=""/>
+      <w:lvlJc w:val="left"/>
+      <w:pPr>
+        <w:ind w:left="5040" w:hanging="360"/>
+      </w:pPr>
+      <w:rPr>
+        <w:rFonts w:ascii="Symbol" w:hAnsi="Symbol" w:hint="default"/>
+      </w:rPr>
+    </w:lvl>
+    <w:lvl w:ilvl="7" w:tplc="08090003" w:tentative="1">
+      <w:start w:val="1"/>
+      <w:numFmt w:val="bullet"/>
+      <w:lvlText w:val="o"/>
+      <w:lvlJc w:val="left"/>
+      <w:pPr>
+        <w:ind w:left="5760" w:hanging="360"/>
+      </w:pPr>
+      <w:rPr>
+        <w:rFonts w:ascii="Courier New" w:hAnsi="Courier New" w:cs="Courier New" w:hint="default"/>
+      </w:rPr>
+    </w:lvl>
+    <w:lvl w:ilvl="8" w:tplc="08090005" w:tentative="1">
+      <w:start w:val="1"/>
+      <w:numFmt w:val="bullet"/>
+      <w:lvlText w:val=""/>
+      <w:lvlJc w:val="left"/>
+      <w:pPr>
+        <w:ind w:left="6480" w:hanging="360"/>
+      </w:pPr>
+      <w:rPr>
+        <w:rFonts w:ascii="Wingdings" w:hAnsi="Wingdings" w:hint="default"/>
+      </w:rPr>
+    </w:lvl>
+  </w:abstractNum>
   <w:num w:numId="1" w16cid:durableId="496457692">
+    <w:abstractNumId w:val="11"/>
+  </w:num>
+  <w:num w:numId="2" w16cid:durableId="1700350490">
+    <w:abstractNumId w:val="1"/>
+  </w:num>
+  <w:num w:numId="3" w16cid:durableId="1401321312">
+    <w:abstractNumId w:val="7"/>
+  </w:num>
+  <w:num w:numId="4" w16cid:durableId="2111315600">
+    <w:abstractNumId w:val="6"/>
+  </w:num>
+  <w:num w:numId="5" w16cid:durableId="22437050">
+    <w:abstractNumId w:val="0"/>
+  </w:num>
+  <w:num w:numId="6" w16cid:durableId="2024552443">
     <w:abstractNumId w:val="3"/>
   </w:num>
-  <w:num w:numId="2" w16cid:durableId="1700350490">
-    <w:abstractNumId w:val="0"/>
+  <w:num w:numId="7" w16cid:durableId="1702777605">
+    <w:abstractNumId w:val="10"/>
   </w:num>
-  <w:num w:numId="3" w16cid:durableId="1401321312">
+  <w:num w:numId="8" w16cid:durableId="1593271806">
+    <w:abstractNumId w:val="5"/>
+  </w:num>
+  <w:num w:numId="9" w16cid:durableId="1449740465">
+    <w:abstractNumId w:val="13"/>
+  </w:num>
+  <w:num w:numId="10" w16cid:durableId="1492522337">
+    <w:abstractNumId w:val="12"/>
+  </w:num>
+  <w:num w:numId="11" w16cid:durableId="96485480">
     <w:abstractNumId w:val="2"/>
   </w:num>
-  <w:num w:numId="4" w16cid:durableId="2111315600">
-    <w:abstractNumId w:val="1"/>
+  <w:num w:numId="12" w16cid:durableId="775178127">
+    <w:abstractNumId w:val="4"/>
+  </w:num>
+  <w:num w:numId="13" w16cid:durableId="323046502">
+    <w:abstractNumId w:val="9"/>
+  </w:num>
+  <w:num w:numId="14" w16cid:durableId="1071928593">
+    <w:abstractNumId w:val="8"/>
   </w:num>
 </w:numbering>
 </file>
@@ -2626,6 +4236,7 @@
   <w:style w:type="character" w:default="1" w:styleId="DefaultParagraphFont">
     <w:name w:val="Default Paragraph Font"/>
     <w:uiPriority w:val="1"/>
+    <w:semiHidden/>
     <w:unhideWhenUsed/>
   </w:style>
   <w:style w:type="table" w:default="1" w:styleId="TableNormal">

</xml_diff>

<commit_message>
Add  required pdf documents
</commit_message>
<xml_diff>
--- a/Summary_Report.docx
+++ b/Summary_Report.docx
@@ -1022,23 +1022,7 @@
           <w:rFonts w:cs="Times New Roman"/>
           <w:color w:val="auto"/>
         </w:rPr>
-        <w:t xml:space="preserve"> functional bugs have been observed while using </w:t>
-      </w:r>
-      <w:proofErr w:type="spellStart"/>
-      <w:r>
-        <w:rPr>
-          <w:rFonts w:cs="Times New Roman"/>
-          <w:color w:val="auto"/>
-        </w:rPr>
-        <w:t>problem_user</w:t>
-      </w:r>
-      <w:proofErr w:type="spellEnd"/>
-      <w:r>
-        <w:rPr>
-          <w:rFonts w:cs="Times New Roman"/>
-          <w:color w:val="auto"/>
-        </w:rPr>
-        <w:t xml:space="preserve"> </w:t>
+        <w:t xml:space="preserve"> functional bugs have been observed while using problem_user </w:t>
       </w:r>
       <w:r>
         <w:rPr>
@@ -1074,17 +1058,8 @@
           <w:rFonts w:cs="Times New Roman"/>
           <w:color w:val="auto"/>
         </w:rPr>
-        <w:t xml:space="preserve">not worked properly for </w:t>
-      </w:r>
-      <w:proofErr w:type="spellStart"/>
-      <w:r>
-        <w:rPr>
-          <w:rFonts w:cs="Times New Roman"/>
-          <w:color w:val="auto"/>
-        </w:rPr>
-        <w:t>problem_user</w:t>
-      </w:r>
-      <w:proofErr w:type="spellEnd"/>
+        <w:t>not worked properly for problem_user</w:t>
+      </w:r>
       <w:r>
         <w:rPr>
           <w:rFonts w:cs="Times New Roman"/>
@@ -1128,7 +1103,6 @@
         </w:rPr>
         <w:t xml:space="preserve">for </w:t>
       </w:r>
-      <w:proofErr w:type="spellStart"/>
       <w:r>
         <w:rPr>
           <w:rFonts w:cs="Times New Roman"/>
@@ -1136,7 +1110,6 @@
         </w:rPr>
         <w:t>problem_user</w:t>
       </w:r>
-      <w:proofErr w:type="spellEnd"/>
       <w:r>
         <w:rPr>
           <w:rFonts w:cs="Times New Roman"/>
@@ -1178,17 +1151,8 @@
           <w:rFonts w:cs="Times New Roman"/>
           <w:color w:val="auto"/>
         </w:rPr>
-        <w:t xml:space="preserve"> </w:t>
-      </w:r>
-      <w:proofErr w:type="spellStart"/>
-      <w:r>
-        <w:rPr>
-          <w:rFonts w:cs="Times New Roman"/>
-          <w:color w:val="auto"/>
-        </w:rPr>
-        <w:t>problem_user</w:t>
-      </w:r>
-      <w:proofErr w:type="spellEnd"/>
+        <w:t xml:space="preserve"> problem_user</w:t>
+      </w:r>
       <w:r>
         <w:rPr>
           <w:rFonts w:cs="Times New Roman"/>
@@ -1223,23 +1187,7 @@
           <w:rFonts w:cs="Times New Roman"/>
           <w:color w:val="auto"/>
         </w:rPr>
-        <w:t xml:space="preserve"> </w:t>
-      </w:r>
-      <w:proofErr w:type="spellStart"/>
-      <w:r>
-        <w:rPr>
-          <w:rFonts w:cs="Times New Roman"/>
-          <w:color w:val="auto"/>
-        </w:rPr>
-        <w:t>standard_user</w:t>
-      </w:r>
-      <w:proofErr w:type="spellEnd"/>
-      <w:r>
-        <w:rPr>
-          <w:rFonts w:cs="Times New Roman"/>
-          <w:color w:val="auto"/>
-        </w:rPr>
-        <w:t xml:space="preserve"> test cases have been completed successfully</w:t>
+        <w:t xml:space="preserve"> standard_user test cases have been completed successfully</w:t>
       </w:r>
       <w:r>
         <w:rPr>
@@ -1268,23 +1216,14 @@
           <w:rFonts w:cs="Times New Roman"/>
           <w:color w:val="auto"/>
         </w:rPr>
-        <w:t xml:space="preserve">“Checkout” button floated top right on </w:t>
-      </w:r>
-      <w:proofErr w:type="spellStart"/>
-      <w:r>
-        <w:rPr>
-          <w:rFonts w:cs="Times New Roman"/>
-          <w:color w:val="auto"/>
-        </w:rPr>
-        <w:t>visual_user</w:t>
-      </w:r>
-      <w:proofErr w:type="spellEnd"/>
-      <w:r>
-        <w:rPr>
-          <w:rFonts w:cs="Times New Roman"/>
-          <w:color w:val="auto"/>
-        </w:rPr>
-        <w:t xml:space="preserve"> profile</w:t>
+        <w:t>“Checkout” button floated top right on visual_user profile</w:t>
+      </w:r>
+      <w:r>
+        <w:rPr>
+          <w:rFonts w:cs="Times New Roman"/>
+          <w:color w:val="auto"/>
+        </w:rPr>
+        <w:t>.</w:t>
       </w:r>
     </w:p>
     <w:p>
@@ -1358,7 +1297,6 @@
         </w:rPr>
         <w:t xml:space="preserve"> </w:t>
       </w:r>
-      <w:proofErr w:type="spellStart"/>
       <w:r>
         <w:rPr>
           <w:rFonts w:cs="Times New Roman"/>
@@ -1366,7 +1304,6 @@
         </w:rPr>
         <w:t>problem_user</w:t>
       </w:r>
-      <w:proofErr w:type="spellEnd"/>
       <w:r>
         <w:rPr>
           <w:rFonts w:cs="Times New Roman"/>
@@ -1408,17 +1345,8 @@
           <w:rFonts w:cs="Times New Roman"/>
           <w:color w:val="auto"/>
         </w:rPr>
-        <w:t xml:space="preserve"> for </w:t>
-      </w:r>
-      <w:proofErr w:type="spellStart"/>
-      <w:r>
-        <w:rPr>
-          <w:rFonts w:cs="Times New Roman"/>
-          <w:color w:val="auto"/>
-        </w:rPr>
-        <w:t>problem_user</w:t>
-      </w:r>
-      <w:proofErr w:type="spellEnd"/>
+        <w:t xml:space="preserve"> for problem_user</w:t>
+      </w:r>
       <w:r>
         <w:rPr>
           <w:rFonts w:cs="Times New Roman"/>
@@ -1453,17 +1381,8 @@
           <w:rFonts w:cs="Times New Roman"/>
           <w:color w:val="auto"/>
         </w:rPr>
-        <w:t xml:space="preserve"> for </w:t>
-      </w:r>
-      <w:proofErr w:type="spellStart"/>
-      <w:r>
-        <w:rPr>
-          <w:rFonts w:cs="Times New Roman"/>
-          <w:color w:val="auto"/>
-        </w:rPr>
-        <w:t>problem_user</w:t>
-      </w:r>
-      <w:proofErr w:type="spellEnd"/>
+        <w:t xml:space="preserve"> for problem_user</w:t>
+      </w:r>
       <w:r>
         <w:rPr>
           <w:rFonts w:cs="Times New Roman"/>
@@ -1533,17 +1452,8 @@
           <w:rFonts w:cs="Times New Roman"/>
           <w:color w:val="auto"/>
         </w:rPr>
-        <w:t xml:space="preserve"> for </w:t>
-      </w:r>
-      <w:proofErr w:type="spellStart"/>
-      <w:r>
-        <w:rPr>
-          <w:rFonts w:cs="Times New Roman"/>
-          <w:color w:val="auto"/>
-        </w:rPr>
-        <w:t>problem_user</w:t>
-      </w:r>
-      <w:proofErr w:type="spellEnd"/>
+        <w:t xml:space="preserve"> for problem_user</w:t>
+      </w:r>
       <w:r>
         <w:rPr>
           <w:rFonts w:cs="Times New Roman"/>
@@ -1643,14 +1553,21 @@
           <w:rFonts w:cs="Times New Roman"/>
           <w:color w:val="auto"/>
         </w:rPr>
-        <w:t xml:space="preserve"> right on the arrow icon</w:t>
-      </w:r>
-      <w:r>
-        <w:rPr>
-          <w:rFonts w:cs="Times New Roman"/>
-          <w:color w:val="auto"/>
-        </w:rPr>
-        <w:t xml:space="preserve">(Even though the mouse </w:t>
+        <w:t xml:space="preserve"> right on the arrow </w:t>
+      </w:r>
+      <w:r>
+        <w:rPr>
+          <w:rFonts w:cs="Times New Roman"/>
+          <w:color w:val="auto"/>
+        </w:rPr>
+        <w:t>icon (</w:t>
+      </w:r>
+      <w:r>
+        <w:rPr>
+          <w:rFonts w:cs="Times New Roman"/>
+          <w:color w:val="auto"/>
+        </w:rPr>
+        <w:t xml:space="preserve">Even though the mouse </w:t>
       </w:r>
       <w:r>
         <w:rPr>
@@ -1700,39 +1617,14 @@
           <w:rFonts w:cs="Times New Roman"/>
           <w:color w:val="auto"/>
         </w:rPr>
-        <w:t xml:space="preserve">There is an alignment issue with the Checkout button on the Cart page when logged in as </w:t>
-      </w:r>
-      <w:proofErr w:type="spellStart"/>
-      <w:r>
-        <w:rPr>
-          <w:rFonts w:cs="Times New Roman"/>
-          <w:color w:val="auto"/>
-        </w:rPr>
-        <w:t>visual_user</w:t>
-      </w:r>
-      <w:proofErr w:type="spellEnd"/>
-      <w:r>
-        <w:rPr>
-          <w:rFonts w:cs="Times New Roman"/>
-          <w:color w:val="auto"/>
-        </w:rPr>
-        <w:t xml:space="preserve">(“Checkout” button floated top right on </w:t>
-      </w:r>
-      <w:proofErr w:type="spellStart"/>
-      <w:r>
-        <w:rPr>
-          <w:rFonts w:cs="Times New Roman"/>
-          <w:color w:val="auto"/>
-        </w:rPr>
-        <w:t>visual_user</w:t>
-      </w:r>
-      <w:proofErr w:type="spellEnd"/>
-      <w:r>
-        <w:rPr>
-          <w:rFonts w:cs="Times New Roman"/>
-          <w:color w:val="auto"/>
-        </w:rPr>
-        <w:t xml:space="preserve"> profile)</w:t>
+        <w:t>There is an alignment issue with the Checkout button on the Cart page when logged in as visual_user</w:t>
+      </w:r>
+      <w:r>
+        <w:rPr>
+          <w:rFonts w:cs="Times New Roman"/>
+          <w:color w:val="auto"/>
+        </w:rPr>
+        <w:t>(“Checkout” button floated top right on visual_user profile)</w:t>
       </w:r>
       <w:r>
         <w:rPr>

</xml_diff>